<commit_message>
rewrote the Fuzz Testing Report secondary document to align it with the other implementation phase processes
</commit_message>
<xml_diff>
--- a/source/reference_documents/secondary_documents/implementation phase/Fuzz Testing Report/Fuzz Testing Report.docx
+++ b/source/reference_documents/secondary_documents/implementation phase/Fuzz Testing Report/Fuzz Testing Report.docx
@@ -1,6 +1,6 @@
 
 <file path=word/document.xml><?xml version="1.0" encoding="utf-8"?>
-<w:document xmlns:wpc="http://schemas.microsoft.com/office/word/2010/wordprocessingCanvas" xmlns:cx="http://schemas.microsoft.com/office/drawing/2014/chartex" xmlns:cx1="http://schemas.microsoft.com/office/drawing/2015/9/8/chartex" xmlns:cx2="http://schemas.microsoft.com/office/drawing/2015/10/21/chartex" xmlns:cx3="http://schemas.microsoft.com/office/drawing/2016/5/9/chartex" xmlns:cx4="http://schemas.microsoft.com/office/drawing/2016/5/10/chartex" xmlns:cx5="http://schemas.microsoft.com/office/drawing/2016/5/11/chartex" xmlns:cx6="http://schemas.microsoft.com/office/drawing/2016/5/12/chartex" xmlns:cx7="http://schemas.microsoft.com/office/drawing/2016/5/13/chartex" xmlns:cx8="http://schemas.microsoft.com/office/drawing/2016/5/14/chartex" xmlns:mc="http://schemas.openxmlformats.org/markup-compatibility/2006" xmlns:aink="http://schemas.microsoft.com/office/drawing/2016/ink" xmlns:am3d="http://schemas.microsoft.com/office/drawing/2017/model3d" xmlns:o="urn:schemas-microsoft-com:office:office" xmlns:oel="http://schemas.microsoft.com/office/2019/extlst" xmlns:r="http://schemas.openxmlformats.org/officeDocument/2006/relationships" xmlns:m="http://schemas.openxmlformats.org/officeDocument/2006/math" xmlns:v="urn:schemas-microsoft-com:vml" xmlns:wp14="http://schemas.microsoft.com/office/word/2010/wordprocessingDrawing" xmlns:wp="http://schemas.openxmlformats.org/drawingml/2006/wordprocessingDrawing" xmlns:w10="urn:schemas-microsoft-com:office:word" xmlns:w="http://schemas.openxmlformats.org/wordprocessingml/2006/main" xmlns:w14="http://schemas.microsoft.com/office/word/2010/wordml" xmlns:w15="http://schemas.microsoft.com/office/word/2012/wordml" xmlns:w16cex="http://schemas.microsoft.com/office/word/2018/wordml/cex" xmlns:w16cid="http://schemas.microsoft.com/office/word/2016/wordml/cid" xmlns:w16="http://schemas.microsoft.com/office/word/2018/wordml" xmlns:w16sdtdh="http://schemas.microsoft.com/office/word/2020/wordml/sdtdatahash" xmlns:w16se="http://schemas.microsoft.com/office/word/2015/wordml/symex" xmlns:wpg="http://schemas.microsoft.com/office/word/2010/wordprocessingGroup" xmlns:wpi="http://schemas.microsoft.com/office/word/2010/wordprocessingInk" xmlns:wne="http://schemas.microsoft.com/office/word/2006/wordml" xmlns:wps="http://schemas.microsoft.com/office/word/2010/wordprocessingShape" mc:Ignorable="w14 w15 w16se w16cid w16 w16cex w16sdtdh wp14">
+<w:document xmlns:wpc="http://schemas.microsoft.com/office/word/2010/wordprocessingCanvas" xmlns:cx="http://schemas.microsoft.com/office/drawing/2014/chartex" xmlns:cx1="http://schemas.microsoft.com/office/drawing/2015/9/8/chartex" xmlns:cx2="http://schemas.microsoft.com/office/drawing/2015/10/21/chartex" xmlns:cx3="http://schemas.microsoft.com/office/drawing/2016/5/9/chartex" xmlns:cx4="http://schemas.microsoft.com/office/drawing/2016/5/10/chartex" xmlns:cx5="http://schemas.microsoft.com/office/drawing/2016/5/11/chartex" xmlns:cx6="http://schemas.microsoft.com/office/drawing/2016/5/12/chartex" xmlns:cx7="http://schemas.microsoft.com/office/drawing/2016/5/13/chartex" xmlns:cx8="http://schemas.microsoft.com/office/drawing/2016/5/14/chartex" xmlns:mc="http://schemas.openxmlformats.org/markup-compatibility/2006" xmlns:aink="http://schemas.microsoft.com/office/drawing/2016/ink" xmlns:am3d="http://schemas.microsoft.com/office/drawing/2017/model3d" xmlns:o="urn:schemas-microsoft-com:office:office" xmlns:oel="http://schemas.microsoft.com/office/2019/extlst" xmlns:r="http://schemas.openxmlformats.org/officeDocument/2006/relationships" xmlns:m="http://schemas.openxmlformats.org/officeDocument/2006/math" xmlns:v="urn:schemas-microsoft-com:vml" xmlns:wp14="http://schemas.microsoft.com/office/word/2010/wordprocessingDrawing" xmlns:wp="http://schemas.openxmlformats.org/drawingml/2006/wordprocessingDrawing" xmlns:w10="urn:schemas-microsoft-com:office:word" xmlns:w="http://schemas.openxmlformats.org/wordprocessingml/2006/main" xmlns:w14="http://schemas.microsoft.com/office/word/2010/wordml" xmlns:w15="http://schemas.microsoft.com/office/word/2012/wordml" xmlns:w16cex="http://schemas.microsoft.com/office/word/2018/wordml/cex" xmlns:w16cid="http://schemas.microsoft.com/office/word/2016/wordml/cid" xmlns:w16="http://schemas.microsoft.com/office/word/2018/wordml" xmlns:w16du="http://schemas.microsoft.com/office/word/2023/wordml/word16du" xmlns:w16sdtdh="http://schemas.microsoft.com/office/word/2020/wordml/sdtdatahash" xmlns:w16sdtfl="http://schemas.microsoft.com/office/word/2024/wordml/sdtformatlock" xmlns:w16se="http://schemas.microsoft.com/office/word/2015/wordml/symex" xmlns:wpg="http://schemas.microsoft.com/office/word/2010/wordprocessingGroup" xmlns:wpi="http://schemas.microsoft.com/office/word/2010/wordprocessingInk" xmlns:wne="http://schemas.microsoft.com/office/word/2006/wordml" xmlns:wps="http://schemas.microsoft.com/office/word/2010/wordprocessingShape" mc:Ignorable="w14 w15 w16se w16cid w16 w16cex w16sdtdh w16sdtfl w16du wp14">
   <w:body>
     <w:p>
       <w:pPr>
@@ -28,7 +28,7 @@
         <w:t xml:space="preserve">Version </w:t>
       </w:r>
       <w:r>
-        <w:t>6</w:t>
+        <w:t>8</w:t>
       </w:r>
     </w:p>
     <w:p>
@@ -45,7 +45,7 @@
         <w:rPr>
           <w:noProof/>
         </w:rPr>
-        <w:t>9/8/23 12:29 PM</w:t>
+        <w:t>4/27/26 8:15 AM</w:t>
       </w:r>
       <w:r>
         <w:fldChar w:fldCharType="end"/>
@@ -61,9 +61,37 @@
     </w:p>
     <w:p>
       <w:pPr>
+        <w:tabs>
+          <w:tab w:val="right" w:pos="990"/>
+          <w:tab w:val="left" w:pos="1260"/>
+        </w:tabs>
         <w:jc w:val="both"/>
       </w:pPr>
       <w:r>
+        <w:tab/>
+        <w:t>Process:</w:t>
+      </w:r>
+      <w:r>
+        <w:tab/>
+        <w:t>Charles Wilson</w:t>
+      </w:r>
+    </w:p>
+    <w:p>
+      <w:pPr>
+        <w:tabs>
+          <w:tab w:val="right" w:pos="990"/>
+          <w:tab w:val="left" w:pos="1260"/>
+        </w:tabs>
+        <w:jc w:val="both"/>
+      </w:pPr>
+      <w:r>
+        <w:tab/>
+        <w:t>Report:</w:t>
+      </w:r>
+      <w:r>
+        <w:tab/>
+      </w:r>
+      <w:r>
         <w:t>Marwan Abi-Antoun</w:t>
       </w:r>
     </w:p>
@@ -89,7 +117,10 @@
         <w:t xml:space="preserve"> to </w:t>
       </w:r>
       <w:r>
-        <w:t>produce a fuzz testing report</w:t>
+        <w:t>create</w:t>
+      </w:r>
+      <w:r>
+        <w:t xml:space="preserve"> a fuzz testing report</w:t>
       </w:r>
       <w:r>
         <w:t>.</w:t>
@@ -136,45 +167,7 @@
         <w:jc w:val="both"/>
       </w:pPr>
       <w:r>
-        <w:t xml:space="preserve">This document is motivated by the need to have runtime-specific, security-related feedback in the development of software for use within safety-critical, cyber-physical systems for certification of compliance to standards such as </w:t>
-      </w:r>
-      <w:r>
-        <w:rPr>
-          <w:b/>
-          <w:bCs/>
-        </w:rPr>
-        <w:t>ISO</w:t>
-      </w:r>
-      <w:r>
-        <w:rPr>
-          <w:b/>
-          <w:bCs/>
-        </w:rPr>
-        <w:t>/SAE</w:t>
-      </w:r>
-      <w:r>
-        <w:rPr>
-          <w:b/>
-          <w:bCs/>
-        </w:rPr>
-        <w:t xml:space="preserve"> 21434</w:t>
-      </w:r>
-      <w:r>
-        <w:t xml:space="preserve"> and </w:t>
-      </w:r>
-      <w:r>
-        <w:rPr>
-          <w:b/>
-          <w:bCs/>
-        </w:rPr>
-        <w:t xml:space="preserve">ISO </w:t>
-      </w:r>
-      <w:r>
-        <w:rPr>
-          <w:b/>
-          <w:bCs/>
-        </w:rPr>
-        <w:t>26262</w:t>
+        <w:t>This document is motivated by the need to have runtime-specific, security-related feedback in the development of software for use within safety-critical, cyber-physical systems</w:t>
       </w:r>
       <w:r>
         <w:t>.</w:t>
@@ -205,14 +198,26 @@
         <w:rPr>
           <w:lang w:val="en-US"/>
         </w:rPr>
-        <w:t xml:space="preserve">was created by </w:t>
-      </w:r>
-      <w:r>
-        <w:rPr>
-          <w:b/>
-          <w:bCs/>
+        <w:t xml:space="preserve">was </w:t>
+      </w:r>
+      <w:r>
+        <w:rPr>
           <w:lang w:val="en-US"/>
         </w:rPr>
+        <w:t xml:space="preserve">originally </w:t>
+      </w:r>
+      <w:r>
+        <w:rPr>
+          <w:lang w:val="en-US"/>
+        </w:rPr>
+        <w:t xml:space="preserve">created by </w:t>
+      </w:r>
+      <w:r>
+        <w:rPr>
+          <w:b/>
+          <w:bCs/>
+          <w:lang w:val="en-US"/>
+        </w:rPr>
         <w:t>Motional</w:t>
       </w:r>
       <w:r>
@@ -233,7 +238,39 @@
           <w:bCs/>
           <w:lang w:val="en-US"/>
         </w:rPr>
-        <w:t>Creative Commons Attribution-Share Alike (CC4-SA)</w:t>
+        <w:t>Creative Commons Attribution-Share Alike (CC</w:t>
+      </w:r>
+      <w:r>
+        <w:rPr>
+          <w:b/>
+          <w:bCs/>
+          <w:lang w:val="en-US"/>
+        </w:rPr>
+        <w:t xml:space="preserve"> BY-</w:t>
+      </w:r>
+      <w:r>
+        <w:rPr>
+          <w:b/>
+          <w:bCs/>
+          <w:lang w:val="en-US"/>
+        </w:rPr>
+        <w:t>SA</w:t>
+      </w:r>
+      <w:r>
+        <w:rPr>
+          <w:b/>
+          <w:bCs/>
+          <w:lang w:val="en-US"/>
+        </w:rPr>
+        <w:t>-4.0</w:t>
+      </w:r>
+      <w:r>
+        <w:rPr>
+          <w:b/>
+          <w:bCs/>
+          <w:lang w:val="en-US"/>
+        </w:rPr>
+        <w:t>)</w:t>
       </w:r>
       <w:r>
         <w:rPr>
@@ -293,7 +330,73 @@
         <w:jc w:val="both"/>
       </w:pPr>
       <w:r>
-        <w:t>Although the quality of security-related feedback from the compiler, static and dynamic analysis tools have become much better over time, there are many situations they do not consider. Fuzz testing provides coverage for some of those deficiencies. Although lacking the level of automation of other methods, fuzz testing allows for highly tailored behavior analysis at the unit level.</w:t>
+        <w:t xml:space="preserve">Although </w:t>
+      </w:r>
+      <w:r>
+        <w:t>cybersecurity-relevant feedback from tooling such as</w:t>
+      </w:r>
+      <w:r>
+        <w:t xml:space="preserve"> compiler</w:t>
+      </w:r>
+      <w:r>
+        <w:t>s</w:t>
+      </w:r>
+      <w:r>
+        <w:t>, static and dynamic analy</w:t>
+      </w:r>
+      <w:r>
+        <w:t>zer</w:t>
+      </w:r>
+      <w:r>
+        <w:t xml:space="preserve">s </w:t>
+      </w:r>
+      <w:r>
+        <w:t>greatly aids in the creation of secure software</w:t>
+      </w:r>
+      <w:r>
+        <w:t xml:space="preserve">, there </w:t>
+      </w:r>
+      <w:r>
+        <w:t>remain</w:t>
+      </w:r>
+      <w:r>
+        <w:t xml:space="preserve"> situations </w:t>
+      </w:r>
+      <w:r>
+        <w:t>which these tools</w:t>
+      </w:r>
+      <w:r>
+        <w:t xml:space="preserve"> do not consider. Fuzz testing</w:t>
+      </w:r>
+      <w:r>
+        <w:t xml:space="preserve"> </w:t>
+      </w:r>
+      <w:r>
+        <w:rPr>
+          <w:b/>
+          <w:bCs/>
+          <w:color w:val="0070C0"/>
+          <w:vertAlign w:val="superscript"/>
+        </w:rPr>
+        <w:t>[2]</w:t>
+      </w:r>
+      <w:r>
+        <w:t xml:space="preserve"> provides coverage for some of those </w:t>
+      </w:r>
+      <w:r>
+        <w:t>situations</w:t>
+      </w:r>
+      <w:r>
+        <w:t>.</w:t>
+      </w:r>
+    </w:p>
+    <w:p>
+      <w:pPr>
+        <w:spacing w:after="240"/>
+        <w:jc w:val="both"/>
+      </w:pPr>
+      <w:r>
+        <w:t>Although lacking the level of automation of other methods, fuzz testing allows for highly tailored behavior analysis at the unit level.</w:t>
       </w:r>
     </w:p>
     <w:p>
@@ -312,14 +415,27 @@
       </w:r>
       <w:r>
         <w:rPr>
-          <w:b/>
-          <w:bCs/>
           <w:color w:val="0070C0"/>
         </w:rPr>
         <w:tab/>
       </w:r>
       <w:r>
-        <w:t>Fuzz testing is a team exercise, encompassing program and project managers, developers, cybersecurity engineers, and testers.</w:t>
+        <w:t xml:space="preserve">Given the nature of this type of analysis (using invalid, unexpected, or random data as inputs), it is </w:t>
+      </w:r>
+      <w:r>
+        <w:t xml:space="preserve">important to not treat fuzz testing as a replacement for more traditional unit testing </w:t>
+      </w:r>
+      <w:r>
+        <w:rPr>
+          <w:b/>
+          <w:bCs/>
+          <w:color w:val="0070C0"/>
+          <w:vertAlign w:val="superscript"/>
+        </w:rPr>
+        <w:t>[7]</w:t>
+      </w:r>
+      <w:r>
+        <w:t>.</w:t>
       </w:r>
     </w:p>
     <w:p>
@@ -341,9 +457,9 @@
           <w:noProof/>
         </w:rPr>
         <w:drawing>
-          <wp:inline distT="0" distB="0" distL="0" distR="0" wp14:anchorId="5B9848C3" wp14:editId="587DFDCB">
-            <wp:extent cx="5943600" cy="1653383"/>
-            <wp:effectExtent l="0" t="0" r="0" b="0"/>
+          <wp:inline distT="0" distB="0" distL="0" distR="0" wp14:anchorId="5B9848C3" wp14:editId="1B7B0C05">
+            <wp:extent cx="6053491" cy="1864043"/>
+            <wp:effectExtent l="0" t="0" r="0" b="3175"/>
             <wp:docPr id="9" name="Picture 9"/>
             <wp:cNvGraphicFramePr>
               <a:graphicFrameLocks xmlns:a="http://schemas.openxmlformats.org/drawingml/2006/main" noChangeAspect="1"/>
@@ -370,7 +486,7 @@
                   <pic:spPr>
                     <a:xfrm>
                       <a:off x="0" y="0"/>
-                      <a:ext cx="5943600" cy="1653383"/>
+                      <a:ext cx="6053491" cy="1864043"/>
                     </a:xfrm>
                     <a:prstGeom prst="rect">
                       <a:avLst/>
@@ -408,12 +524,12 @@
         <w:pStyle w:val="Heading2"/>
       </w:pPr>
       <w:r>
-        <w:t>Plan Creation</w:t>
+        <w:t>Establish Settings</w:t>
       </w:r>
     </w:p>
     <w:tbl>
       <w:tblPr>
-        <w:tblW w:w="3770" w:type="dxa"/>
+        <w:tblW w:w="5570" w:type="dxa"/>
         <w:tblBorders>
           <w:top w:val="single" w:sz="8" w:space="0" w:color="000000"/>
           <w:left w:val="single" w:sz="8" w:space="0" w:color="000000"/>
@@ -427,13 +543,12 @@
       </w:tblPr>
       <w:tblGrid>
         <w:gridCol w:w="1520"/>
-        <w:gridCol w:w="2250"/>
+        <w:gridCol w:w="4050"/>
       </w:tblGrid>
       <w:tr>
         <w:tc>
           <w:tcPr>
             <w:tcW w:w="1520" w:type="dxa"/>
-            <w:shd w:val="clear" w:color="auto" w:fill="auto"/>
             <w:tcMar>
               <w:top w:w="100" w:type="dxa"/>
               <w:left w:w="100" w:type="dxa"/>
@@ -463,8 +578,7 @@
         </w:tc>
         <w:tc>
           <w:tcPr>
-            <w:tcW w:w="2250" w:type="dxa"/>
-            <w:shd w:val="clear" w:color="auto" w:fill="auto"/>
+            <w:tcW w:w="4050" w:type="dxa"/>
             <w:tcMar>
               <w:top w:w="100" w:type="dxa"/>
               <w:left w:w="100" w:type="dxa"/>
@@ -478,7 +592,29 @@
               <w:spacing w:line="240" w:lineRule="auto"/>
             </w:pPr>
             <w:r>
-              <w:t>element</w:t>
+              <w:t>Build file</w:t>
+            </w:r>
+          </w:p>
+          <w:p>
+            <w:pPr>
+              <w:widowControl w:val="0"/>
+              <w:spacing w:line="240" w:lineRule="auto"/>
+            </w:pPr>
+            <w:r>
+              <w:t>E</w:t>
+            </w:r>
+            <w:r>
+              <w:t>lement</w:t>
+            </w:r>
+          </w:p>
+          <w:p>
+            <w:pPr>
+              <w:widowControl w:val="0"/>
+              <w:spacing w:line="240" w:lineRule="auto"/>
+              <w:ind w:right="-105"/>
+            </w:pPr>
+            <w:r>
+              <w:t>Fuzz testing framework documentation</w:t>
             </w:r>
           </w:p>
         </w:tc>
@@ -487,7 +623,6 @@
         <w:tc>
           <w:tcPr>
             <w:tcW w:w="1520" w:type="dxa"/>
-            <w:shd w:val="clear" w:color="auto" w:fill="auto"/>
             <w:tcMar>
               <w:top w:w="100" w:type="dxa"/>
               <w:left w:w="100" w:type="dxa"/>
@@ -517,8 +652,7 @@
         </w:tc>
         <w:tc>
           <w:tcPr>
-            <w:tcW w:w="2250" w:type="dxa"/>
-            <w:shd w:val="clear" w:color="auto" w:fill="auto"/>
+            <w:tcW w:w="4050" w:type="dxa"/>
             <w:tcMar>
               <w:top w:w="100" w:type="dxa"/>
               <w:left w:w="100" w:type="dxa"/>
@@ -532,7 +666,16 @@
               <w:spacing w:line="240" w:lineRule="auto"/>
             </w:pPr>
             <w:r>
-              <w:t>Fuzz Testing Plan</w:t>
+              <w:t>Updated build file</w:t>
+            </w:r>
+          </w:p>
+          <w:p>
+            <w:pPr>
+              <w:widowControl w:val="0"/>
+              <w:spacing w:line="240" w:lineRule="auto"/>
+            </w:pPr>
+            <w:r>
+              <w:t>Security options qualification report</w:t>
             </w:r>
           </w:p>
         </w:tc>
@@ -541,7 +684,6 @@
         <w:tc>
           <w:tcPr>
             <w:tcW w:w="1520" w:type="dxa"/>
-            <w:shd w:val="clear" w:color="auto" w:fill="auto"/>
             <w:tcMar>
               <w:top w:w="100" w:type="dxa"/>
               <w:left w:w="100" w:type="dxa"/>
@@ -571,8 +713,7 @@
         </w:tc>
         <w:tc>
           <w:tcPr>
-            <w:tcW w:w="2250" w:type="dxa"/>
-            <w:shd w:val="clear" w:color="auto" w:fill="auto"/>
+            <w:tcW w:w="4050" w:type="dxa"/>
             <w:tcMar>
               <w:top w:w="100" w:type="dxa"/>
               <w:left w:w="100" w:type="dxa"/>
@@ -580,6 +721,15 @@
               <w:right w:w="100" w:type="dxa"/>
             </w:tcMar>
           </w:tcPr>
+          <w:p>
+            <w:pPr>
+              <w:widowControl w:val="0"/>
+              <w:spacing w:line="240" w:lineRule="auto"/>
+            </w:pPr>
+            <w:r>
+              <w:t>Development SME</w:t>
+            </w:r>
+          </w:p>
           <w:p>
             <w:pPr>
               <w:widowControl w:val="0"/>
@@ -595,7 +745,10 @@
               <w:spacing w:line="240" w:lineRule="auto"/>
             </w:pPr>
             <w:r>
-              <w:t>Development SME</w:t>
+              <w:t>DevOps</w:t>
+            </w:r>
+            <w:r>
+              <w:t xml:space="preserve"> SME</w:t>
             </w:r>
           </w:p>
         </w:tc>
@@ -611,10 +764,10 @@
           <w:noProof/>
         </w:rPr>
         <w:drawing>
-          <wp:inline distT="0" distB="0" distL="0" distR="0" wp14:anchorId="76FE7134" wp14:editId="1A49D15A">
-            <wp:extent cx="3686711" cy="4387273"/>
+          <wp:inline distT="0" distB="0" distL="0" distR="0" wp14:anchorId="76FE7134" wp14:editId="43D92447">
+            <wp:extent cx="3684761" cy="4384954"/>
             <wp:effectExtent l="0" t="0" r="0" b="0"/>
-            <wp:docPr id="2" name="Picture 2" descr="Diagram&#10;&#10;Description automatically generated"/>
+            <wp:docPr id="2" name="Picture 2"/>
             <wp:cNvGraphicFramePr>
               <a:graphicFrameLocks xmlns:a="http://schemas.openxmlformats.org/drawingml/2006/main" noChangeAspect="1"/>
             </wp:cNvGraphicFramePr>
@@ -622,11 +775,17 @@
               <a:graphicData uri="http://schemas.openxmlformats.org/drawingml/2006/picture">
                 <pic:pic xmlns:pic="http://schemas.openxmlformats.org/drawingml/2006/picture">
                   <pic:nvPicPr>
-                    <pic:cNvPr id="2" name="Picture 2" descr="Diagram&#10;&#10;Description automatically generated"/>
+                    <pic:cNvPr id="2" name="Picture 2"/>
                     <pic:cNvPicPr/>
                   </pic:nvPicPr>
                   <pic:blipFill>
-                    <a:blip r:embed="rId9"/>
+                    <a:blip r:embed="rId9" cstate="print">
+                      <a:extLst>
+                        <a:ext uri="{28A0092B-C50C-407E-A947-70E740481C1C}">
+                          <a14:useLocalDpi xmlns:a14="http://schemas.microsoft.com/office/drawing/2010/main" val="0"/>
+                        </a:ext>
+                      </a:extLst>
+                    </a:blip>
                     <a:stretch>
                       <a:fillRect/>
                     </a:stretch>
@@ -634,7 +793,7 @@
                   <pic:spPr>
                     <a:xfrm>
                       <a:off x="0" y="0"/>
-                      <a:ext cx="3742419" cy="4453567"/>
+                      <a:ext cx="3689447" cy="4390530"/>
                     </a:xfrm>
                     <a:prstGeom prst="rect">
                       <a:avLst/>
@@ -649,10 +808,16 @@
     </w:p>
     <w:p/>
     <w:p>
+      <w:r>
+        <w:br w:type="page"/>
+      </w:r>
+    </w:p>
+    <w:p>
       <w:pPr>
         <w:jc w:val="both"/>
       </w:pPr>
       <w:r>
+        <w:lastRenderedPageBreak/>
         <w:t xml:space="preserve">Using the </w:t>
       </w:r>
       <w:r>
@@ -660,45 +825,99 @@
           <w:b/>
           <w:bCs/>
         </w:rPr>
-        <w:t>E</w:t>
-      </w:r>
-      <w:r>
-        <w:rPr>
-          <w:b/>
-          <w:bCs/>
-        </w:rPr>
-        <w:t>lement</w:t>
-      </w:r>
-      <w:r>
-        <w:t>’s interface, t</w:t>
-      </w:r>
-      <w:r>
-        <w:t>he Fuzz Testing SME</w:t>
-      </w:r>
-      <w:r>
-        <w:t xml:space="preserve"> and</w:t>
-      </w:r>
-      <w:r>
-        <w:t xml:space="preserve"> Development SME, identify the areas of the implementation that </w:t>
-      </w:r>
-      <w:r>
-        <w:t>would</w:t>
-      </w:r>
-      <w:r>
-        <w:t xml:space="preserve"> benefit from fuzz testing,</w:t>
-      </w:r>
-      <w:r>
-        <w:t xml:space="preserve"> </w:t>
-      </w:r>
-      <w:r>
-        <w:t xml:space="preserve">and develop a </w:t>
-      </w:r>
-      <w:r>
-        <w:rPr>
-          <w:b/>
-          <w:bCs/>
-        </w:rPr>
-        <w:t>Fuzz Testing Plan</w:t>
+        <w:t>Element</w:t>
+      </w:r>
+      <w:r>
+        <w:t xml:space="preserve"> under consideration, </w:t>
+      </w:r>
+      <w:r>
+        <w:rPr>
+          <w:b/>
+          <w:bCs/>
+        </w:rPr>
+        <w:t>Fuzz Testing Framework Documentation</w:t>
+      </w:r>
+      <w:r>
+        <w:t xml:space="preserve">, and </w:t>
+      </w:r>
+      <w:r>
+        <w:rPr>
+          <w:b/>
+          <w:bCs/>
+        </w:rPr>
+        <w:t>Build File</w:t>
+      </w:r>
+      <w:r>
+        <w:t xml:space="preserve">; the </w:t>
+      </w:r>
+      <w:r>
+        <w:rPr>
+          <w:b/>
+          <w:bCs/>
+        </w:rPr>
+        <w:t>Development SME</w:t>
+      </w:r>
+      <w:r>
+        <w:t xml:space="preserve">, </w:t>
+      </w:r>
+      <w:r>
+        <w:rPr>
+          <w:b/>
+          <w:bCs/>
+        </w:rPr>
+        <w:t>Fuzz Testing SME</w:t>
+      </w:r>
+      <w:r>
+        <w:t xml:space="preserve">, and </w:t>
+      </w:r>
+      <w:r>
+        <w:rPr>
+          <w:b/>
+          <w:bCs/>
+        </w:rPr>
+        <w:t>DevOps SME</w:t>
+      </w:r>
+      <w:r>
+        <w:t xml:space="preserve"> will work together following the </w:t>
+      </w:r>
+      <w:r>
+        <w:rPr>
+          <w:b/>
+          <w:bCs/>
+        </w:rPr>
+        <w:t xml:space="preserve">Secure Settings </w:t>
+      </w:r>
+      <w:r>
+        <w:rPr>
+          <w:b/>
+          <w:bCs/>
+          <w:color w:val="0070C0"/>
+          <w:vertAlign w:val="superscript"/>
+        </w:rPr>
+        <w:t>[4]</w:t>
+      </w:r>
+      <w:r>
+        <w:t xml:space="preserve"> process to determine what element aspect needs to be fuzz tested and whether the element will require any kind of instrumentation to enable that testing. An </w:t>
+      </w:r>
+      <w:r>
+        <w:rPr>
+          <w:b/>
+          <w:bCs/>
+        </w:rPr>
+        <w:t>Updated Build File</w:t>
+      </w:r>
+      <w:r>
+        <w:t xml:space="preserve"> will be produced. A </w:t>
+      </w:r>
+      <w:r>
+        <w:rPr>
+          <w:b/>
+          <w:bCs/>
+        </w:rPr>
+        <w:t>Security Options Qualifications Report</w:t>
+      </w:r>
+      <w:r>
+        <w:t xml:space="preserve"> is generated</w:t>
       </w:r>
       <w:r>
         <w:t>.</w:t>
@@ -729,20 +948,27 @@
         <w:tab/>
       </w:r>
       <w:r>
-        <w:t xml:space="preserve">The </w:t>
-      </w:r>
-      <w:r>
-        <w:rPr>
-          <w:b/>
-          <w:bCs/>
-        </w:rPr>
-        <w:t>Fuzz Testing Plan</w:t>
-      </w:r>
-      <w:r>
-        <w:t xml:space="preserve"> </w:t>
-      </w:r>
-      <w:r>
-        <w:t>is refined iteratively.</w:t>
+        <w:t xml:space="preserve">The scope of the </w:t>
+      </w:r>
+      <w:r>
+        <w:rPr>
+          <w:b/>
+          <w:bCs/>
+        </w:rPr>
+        <w:t>E</w:t>
+      </w:r>
+      <w:r>
+        <w:rPr>
+          <w:b/>
+          <w:bCs/>
+        </w:rPr>
+        <w:t>lement</w:t>
+      </w:r>
+      <w:r>
+        <w:t xml:space="preserve"> may be as small as a single file or as large as the entire project</w:t>
+      </w:r>
+      <w:r>
+        <w:t>.</w:t>
       </w:r>
     </w:p>
     <w:p>
@@ -766,7 +992,7 @@
       </w:pPr>
       <w:r>
         <w:lastRenderedPageBreak/>
-        <w:t>Harness Development</w:t>
+        <w:t>Create Test</w:t>
       </w:r>
     </w:p>
     <w:tbl>
@@ -791,7 +1017,6 @@
         <w:tc>
           <w:tcPr>
             <w:tcW w:w="1520" w:type="dxa"/>
-            <w:shd w:val="clear" w:color="auto" w:fill="auto"/>
             <w:tcMar>
               <w:top w:w="100" w:type="dxa"/>
               <w:left w:w="100" w:type="dxa"/>
@@ -822,7 +1047,6 @@
         <w:tc>
           <w:tcPr>
             <w:tcW w:w="3150" w:type="dxa"/>
-            <w:shd w:val="clear" w:color="auto" w:fill="auto"/>
             <w:tcMar>
               <w:top w:w="100" w:type="dxa"/>
               <w:left w:w="100" w:type="dxa"/>
@@ -836,7 +1060,7 @@
               <w:spacing w:line="240" w:lineRule="auto"/>
             </w:pPr>
             <w:r>
-              <w:t>Implemented system element</w:t>
+              <w:t>Updated build file</w:t>
             </w:r>
           </w:p>
           <w:p>
@@ -845,7 +1069,13 @@
               <w:spacing w:line="240" w:lineRule="auto"/>
             </w:pPr>
             <w:r>
-              <w:t>Fuzz Testing Plan</w:t>
+              <w:t xml:space="preserve">Element </w:t>
+            </w:r>
+            <w:r>
+              <w:t xml:space="preserve">unit </w:t>
+            </w:r>
+            <w:r>
+              <w:t>test</w:t>
             </w:r>
           </w:p>
         </w:tc>
@@ -854,7 +1084,6 @@
         <w:tc>
           <w:tcPr>
             <w:tcW w:w="1520" w:type="dxa"/>
-            <w:shd w:val="clear" w:color="auto" w:fill="auto"/>
             <w:tcMar>
               <w:top w:w="100" w:type="dxa"/>
               <w:left w:w="100" w:type="dxa"/>
@@ -885,7 +1114,6 @@
         <w:tc>
           <w:tcPr>
             <w:tcW w:w="3150" w:type="dxa"/>
-            <w:shd w:val="clear" w:color="auto" w:fill="auto"/>
             <w:tcMar>
               <w:top w:w="100" w:type="dxa"/>
               <w:left w:w="100" w:type="dxa"/>
@@ -899,7 +1127,7 @@
               <w:spacing w:line="240" w:lineRule="auto"/>
             </w:pPr>
             <w:r>
-              <w:t>Fuzzing harness</w:t>
+              <w:t>Element fuzz test</w:t>
             </w:r>
           </w:p>
         </w:tc>
@@ -908,7 +1136,6 @@
         <w:tc>
           <w:tcPr>
             <w:tcW w:w="1520" w:type="dxa"/>
-            <w:shd w:val="clear" w:color="auto" w:fill="auto"/>
             <w:tcMar>
               <w:top w:w="100" w:type="dxa"/>
               <w:left w:w="100" w:type="dxa"/>
@@ -939,7 +1166,6 @@
         <w:tc>
           <w:tcPr>
             <w:tcW w:w="3150" w:type="dxa"/>
-            <w:shd w:val="clear" w:color="auto" w:fill="auto"/>
             <w:tcMar>
               <w:top w:w="100" w:type="dxa"/>
               <w:left w:w="100" w:type="dxa"/>
@@ -962,7 +1188,10 @@
               <w:spacing w:line="240" w:lineRule="auto"/>
             </w:pPr>
             <w:r>
-              <w:t>Development SME</w:t>
+              <w:t>DevOps</w:t>
+            </w:r>
+            <w:r>
+              <w:t xml:space="preserve"> SME</w:t>
             </w:r>
           </w:p>
         </w:tc>
@@ -978,10 +1207,10 @@
           <w:noProof/>
         </w:rPr>
         <w:drawing>
-          <wp:inline distT="0" distB="0" distL="0" distR="0" wp14:anchorId="1CF12E1B" wp14:editId="6B82956D">
-            <wp:extent cx="4649985" cy="4387273"/>
-            <wp:effectExtent l="0" t="0" r="0" b="0"/>
-            <wp:docPr id="4" name="Picture 4" descr="Diagram&#10;&#10;Description automatically generated"/>
+          <wp:inline distT="0" distB="0" distL="0" distR="0" wp14:anchorId="1CF12E1B" wp14:editId="7FEF541E">
+            <wp:extent cx="4533194" cy="4401415"/>
+            <wp:effectExtent l="0" t="0" r="1270" b="5715"/>
+            <wp:docPr id="4" name="Picture 4"/>
             <wp:cNvGraphicFramePr>
               <a:graphicFrameLocks xmlns:a="http://schemas.openxmlformats.org/drawingml/2006/main" noChangeAspect="1"/>
             </wp:cNvGraphicFramePr>
@@ -989,11 +1218,17 @@
               <a:graphicData uri="http://schemas.openxmlformats.org/drawingml/2006/picture">
                 <pic:pic xmlns:pic="http://schemas.openxmlformats.org/drawingml/2006/picture">
                   <pic:nvPicPr>
-                    <pic:cNvPr id="4" name="Picture 4" descr="Diagram&#10;&#10;Description automatically generated"/>
+                    <pic:cNvPr id="4" name="Picture 4"/>
                     <pic:cNvPicPr/>
                   </pic:nvPicPr>
                   <pic:blipFill>
-                    <a:blip r:embed="rId10"/>
+                    <a:blip r:embed="rId10" cstate="print">
+                      <a:extLst>
+                        <a:ext uri="{28A0092B-C50C-407E-A947-70E740481C1C}">
+                          <a14:useLocalDpi xmlns:a14="http://schemas.microsoft.com/office/drawing/2010/main" val="0"/>
+                        </a:ext>
+                      </a:extLst>
+                    </a:blip>
                     <a:stretch>
                       <a:fillRect/>
                     </a:stretch>
@@ -1001,7 +1236,7 @@
                   <pic:spPr>
                     <a:xfrm>
                       <a:off x="0" y="0"/>
-                      <a:ext cx="4664975" cy="4401416"/>
+                      <a:ext cx="4533194" cy="4401415"/>
                     </a:xfrm>
                     <a:prstGeom prst="rect">
                       <a:avLst/>
@@ -1020,41 +1255,114 @@
         <w:jc w:val="both"/>
       </w:pPr>
       <w:r>
-        <w:t xml:space="preserve">The Fuzz Testing SME and Development SME develop a </w:t>
-      </w:r>
-      <w:r>
-        <w:rPr>
-          <w:b/>
-          <w:bCs/>
-        </w:rPr>
-        <w:t>Fuzzing Harness</w:t>
-      </w:r>
-      <w:r>
-        <w:t xml:space="preserve"> for the </w:t>
-      </w:r>
-      <w:r>
-        <w:rPr>
-          <w:b/>
-          <w:bCs/>
-        </w:rPr>
-        <w:t>Implemented Element</w:t>
-      </w:r>
-      <w:r>
-        <w:t xml:space="preserve"> based on the </w:t>
-      </w:r>
-      <w:r>
-        <w:rPr>
-          <w:b/>
-          <w:bCs/>
-        </w:rPr>
-        <w:t xml:space="preserve">Fuzz Testing </w:t>
-      </w:r>
-      <w:r>
-        <w:rPr>
-          <w:b/>
-          <w:bCs/>
-        </w:rPr>
-        <w:t>Plan</w:t>
+        <w:t xml:space="preserve">Using the </w:t>
+      </w:r>
+      <w:r>
+        <w:rPr>
+          <w:b/>
+          <w:bCs/>
+        </w:rPr>
+        <w:t>Updated Build File</w:t>
+      </w:r>
+      <w:r>
+        <w:t>,</w:t>
+      </w:r>
+      <w:r>
+        <w:t xml:space="preserve"> the</w:t>
+      </w:r>
+      <w:r>
+        <w:t xml:space="preserve"> </w:t>
+      </w:r>
+      <w:r>
+        <w:rPr>
+          <w:b/>
+          <w:bCs/>
+        </w:rPr>
+        <w:t>Fuzz Testing SME</w:t>
+      </w:r>
+      <w:r>
+        <w:t xml:space="preserve"> and </w:t>
+      </w:r>
+      <w:r>
+        <w:rPr>
+          <w:b/>
+          <w:bCs/>
+        </w:rPr>
+        <w:t>DevOps</w:t>
+      </w:r>
+      <w:r>
+        <w:rPr>
+          <w:b/>
+          <w:bCs/>
+        </w:rPr>
+        <w:t xml:space="preserve"> SME</w:t>
+      </w:r>
+      <w:r>
+        <w:t xml:space="preserve"> </w:t>
+      </w:r>
+      <w:r>
+        <w:t>take the</w:t>
+      </w:r>
+      <w:r>
+        <w:t xml:space="preserve"> </w:t>
+      </w:r>
+      <w:r>
+        <w:rPr>
+          <w:b/>
+          <w:bCs/>
+        </w:rPr>
+        <w:t xml:space="preserve">Element </w:t>
+      </w:r>
+      <w:r>
+        <w:rPr>
+          <w:b/>
+          <w:bCs/>
+        </w:rPr>
+        <w:t xml:space="preserve">Unit </w:t>
+      </w:r>
+      <w:r>
+        <w:rPr>
+          <w:b/>
+          <w:bCs/>
+        </w:rPr>
+        <w:t>Test</w:t>
+      </w:r>
+      <w:r>
+        <w:t xml:space="preserve"> </w:t>
+      </w:r>
+      <w:r>
+        <w:t>and create an</w:t>
+      </w:r>
+      <w:r>
+        <w:t xml:space="preserve"> </w:t>
+      </w:r>
+      <w:r>
+        <w:rPr>
+          <w:b/>
+          <w:bCs/>
+        </w:rPr>
+        <w:t>Element</w:t>
+      </w:r>
+      <w:r>
+        <w:rPr>
+          <w:b/>
+          <w:bCs/>
+        </w:rPr>
+        <w:t xml:space="preserve"> </w:t>
+      </w:r>
+      <w:r>
+        <w:rPr>
+          <w:b/>
+          <w:bCs/>
+        </w:rPr>
+        <w:t xml:space="preserve">Fuzz </w:t>
+      </w:r>
+      <w:r>
+        <w:rPr>
+          <w:b/>
+          <w:bCs/>
+        </w:rPr>
+        <w:t>Test</w:t>
       </w:r>
       <w:r>
         <w:t>.</w:t>
@@ -1081,11 +1389,27 @@
       </w:r>
       <w:r>
         <w:tab/>
-        <w:t>It is easier to develop a fuzzing harness for code that is unit testable.</w:t>
-      </w:r>
-    </w:p>
-    <w:p>
-      <w:pPr>
+      </w:r>
+      <w:r>
+        <w:t xml:space="preserve">This activity may be done without the assistance of the </w:t>
+      </w:r>
+      <w:r>
+        <w:rPr>
+          <w:b/>
+          <w:bCs/>
+        </w:rPr>
+        <w:t>DevOps SME</w:t>
+      </w:r>
+      <w:r>
+        <w:t>.</w:t>
+      </w:r>
+      <w:r>
+        <w:t xml:space="preserve"> It may also be fully automated.</w:t>
+      </w:r>
+    </w:p>
+    <w:p>
+      <w:pPr>
+        <w:spacing w:after="240"/>
         <w:ind w:left="720" w:hanging="720"/>
         <w:jc w:val="both"/>
       </w:pPr>
@@ -1099,16 +1423,8 @@
       </w:r>
       <w:r>
         <w:tab/>
-        <w:t>The fuzzing harness should be created concurrently with the unit tests.</w:t>
-      </w:r>
-    </w:p>
-    <w:p>
-      <w:pPr>
-        <w:rPr>
-          <w:sz w:val="32"/>
-          <w:szCs w:val="32"/>
-        </w:rPr>
-      </w:pPr>
+        <w:t>It is not recommended to fuzz test elements which have no existing element unit tests.</w:t>
+      </w:r>
       <w:r>
         <w:br w:type="page"/>
       </w:r>
@@ -1119,12 +1435,15 @@
       </w:pPr>
       <w:r>
         <w:lastRenderedPageBreak/>
-        <w:t>Fuzz Testing</w:t>
+        <w:t>Perform</w:t>
+      </w:r>
+      <w:r>
+        <w:t xml:space="preserve"> Testing</w:t>
       </w:r>
     </w:p>
     <w:tbl>
       <w:tblPr>
-        <w:tblW w:w="3860" w:type="dxa"/>
+        <w:tblW w:w="4400" w:type="dxa"/>
         <w:tblBorders>
           <w:top w:val="single" w:sz="8" w:space="0" w:color="000000"/>
           <w:left w:val="single" w:sz="8" w:space="0" w:color="000000"/>
@@ -1138,13 +1457,12 @@
       </w:tblPr>
       <w:tblGrid>
         <w:gridCol w:w="1520"/>
-        <w:gridCol w:w="2340"/>
+        <w:gridCol w:w="2880"/>
       </w:tblGrid>
       <w:tr>
         <w:tc>
           <w:tcPr>
             <w:tcW w:w="1520" w:type="dxa"/>
-            <w:shd w:val="clear" w:color="auto" w:fill="auto"/>
             <w:tcMar>
               <w:top w:w="100" w:type="dxa"/>
               <w:left w:w="100" w:type="dxa"/>
@@ -1174,8 +1492,7 @@
         </w:tc>
         <w:tc>
           <w:tcPr>
-            <w:tcW w:w="2340" w:type="dxa"/>
-            <w:shd w:val="clear" w:color="auto" w:fill="auto"/>
+            <w:tcW w:w="2880" w:type="dxa"/>
             <w:tcMar>
               <w:top w:w="100" w:type="dxa"/>
               <w:left w:w="100" w:type="dxa"/>
@@ -1189,7 +1506,16 @@
               <w:spacing w:line="240" w:lineRule="auto"/>
             </w:pPr>
             <w:r>
-              <w:t>Fuzz harness</w:t>
+              <w:t>E</w:t>
+            </w:r>
+            <w:r>
+              <w:t>lement</w:t>
+            </w:r>
+            <w:r>
+              <w:t xml:space="preserve"> fuzz</w:t>
+            </w:r>
+            <w:r>
+              <w:t xml:space="preserve"> test</w:t>
             </w:r>
           </w:p>
         </w:tc>
@@ -1198,7 +1524,6 @@
         <w:tc>
           <w:tcPr>
             <w:tcW w:w="1520" w:type="dxa"/>
-            <w:shd w:val="clear" w:color="auto" w:fill="auto"/>
             <w:tcMar>
               <w:top w:w="100" w:type="dxa"/>
               <w:left w:w="100" w:type="dxa"/>
@@ -1228,8 +1553,7 @@
         </w:tc>
         <w:tc>
           <w:tcPr>
-            <w:tcW w:w="2340" w:type="dxa"/>
-            <w:shd w:val="clear" w:color="auto" w:fill="auto"/>
+            <w:tcW w:w="2880" w:type="dxa"/>
             <w:tcMar>
               <w:top w:w="100" w:type="dxa"/>
               <w:left w:w="100" w:type="dxa"/>
@@ -1243,7 +1567,10 @@
               <w:spacing w:line="240" w:lineRule="auto"/>
             </w:pPr>
             <w:r>
-              <w:t>Fuzz testing findings</w:t>
+              <w:t xml:space="preserve">Fuzz testing </w:t>
+            </w:r>
+            <w:r>
+              <w:t>output</w:t>
             </w:r>
           </w:p>
         </w:tc>
@@ -1252,7 +1579,6 @@
         <w:tc>
           <w:tcPr>
             <w:tcW w:w="1520" w:type="dxa"/>
-            <w:shd w:val="clear" w:color="auto" w:fill="auto"/>
             <w:tcMar>
               <w:top w:w="100" w:type="dxa"/>
               <w:left w:w="100" w:type="dxa"/>
@@ -1282,8 +1608,7 @@
         </w:tc>
         <w:tc>
           <w:tcPr>
-            <w:tcW w:w="2340" w:type="dxa"/>
-            <w:shd w:val="clear" w:color="auto" w:fill="auto"/>
+            <w:tcW w:w="2880" w:type="dxa"/>
             <w:tcMar>
               <w:top w:w="100" w:type="dxa"/>
               <w:left w:w="100" w:type="dxa"/>
@@ -1321,10 +1646,10 @@
           <w:noProof/>
         </w:rPr>
         <w:drawing>
-          <wp:inline distT="0" distB="0" distL="0" distR="0" wp14:anchorId="0BAB6BB7" wp14:editId="4A4FFB5C">
-            <wp:extent cx="3509818" cy="4385084"/>
-            <wp:effectExtent l="0" t="0" r="0" b="0"/>
-            <wp:docPr id="3" name="Picture 3" descr="Diagram&#10;&#10;Description automatically generated"/>
+          <wp:inline distT="0" distB="0" distL="0" distR="0" wp14:anchorId="0BAB6BB7" wp14:editId="7F4FA013">
+            <wp:extent cx="3541582" cy="4317112"/>
+            <wp:effectExtent l="0" t="0" r="1905" b="1270"/>
+            <wp:docPr id="3" name="Picture 3"/>
             <wp:cNvGraphicFramePr>
               <a:graphicFrameLocks xmlns:a="http://schemas.openxmlformats.org/drawingml/2006/main" noChangeAspect="1"/>
             </wp:cNvGraphicFramePr>
@@ -1332,11 +1657,17 @@
               <a:graphicData uri="http://schemas.openxmlformats.org/drawingml/2006/picture">
                 <pic:pic xmlns:pic="http://schemas.openxmlformats.org/drawingml/2006/picture">
                   <pic:nvPicPr>
-                    <pic:cNvPr id="9" name="Picture 9" descr="Diagram&#10;&#10;Description automatically generated"/>
+                    <pic:cNvPr id="3" name="Picture 3"/>
                     <pic:cNvPicPr/>
                   </pic:nvPicPr>
                   <pic:blipFill>
-                    <a:blip r:embed="rId11"/>
+                    <a:blip r:embed="rId11" cstate="print">
+                      <a:extLst>
+                        <a:ext uri="{28A0092B-C50C-407E-A947-70E740481C1C}">
+                          <a14:useLocalDpi xmlns:a14="http://schemas.microsoft.com/office/drawing/2010/main" val="0"/>
+                        </a:ext>
+                      </a:extLst>
+                    </a:blip>
                     <a:stretch>
                       <a:fillRect/>
                     </a:stretch>
@@ -1344,7 +1675,7 @@
                   <pic:spPr>
                     <a:xfrm>
                       <a:off x="0" y="0"/>
-                      <a:ext cx="3541583" cy="4424771"/>
+                      <a:ext cx="3541582" cy="4317112"/>
                     </a:xfrm>
                     <a:prstGeom prst="rect">
                       <a:avLst/>
@@ -1360,39 +1691,83 @@
     <w:p/>
     <w:p>
       <w:pPr>
+        <w:spacing w:after="240"/>
         <w:jc w:val="both"/>
       </w:pPr>
       <w:r>
-        <w:t xml:space="preserve">The </w:t>
-      </w:r>
-      <w:r>
-        <w:rPr>
-          <w:b/>
-          <w:bCs/>
-        </w:rPr>
-        <w:t>Fuzz Harness</w:t>
+        <w:t>The</w:t>
+      </w:r>
+      <w:r>
+        <w:t xml:space="preserve"> build invokes the</w:t>
       </w:r>
       <w:r>
         <w:t xml:space="preserve"> </w:t>
       </w:r>
       <w:r>
-        <w:t xml:space="preserve">is invoked and </w:t>
-      </w:r>
-      <w:r>
-        <w:t>produces</w:t>
+        <w:rPr>
+          <w:b/>
+          <w:bCs/>
+        </w:rPr>
+        <w:t>Element</w:t>
+      </w:r>
+      <w:r>
+        <w:rPr>
+          <w:b/>
+          <w:bCs/>
+        </w:rPr>
+        <w:t xml:space="preserve"> Fuzz</w:t>
+      </w:r>
+      <w:r>
+        <w:rPr>
+          <w:b/>
+          <w:bCs/>
+        </w:rPr>
+        <w:t xml:space="preserve"> Test</w:t>
       </w:r>
       <w:r>
         <w:t xml:space="preserve"> </w:t>
       </w:r>
       <w:r>
-        <w:rPr>
-          <w:b/>
-          <w:bCs/>
-        </w:rPr>
-        <w:t>Fuzz Testing Findings</w:t>
+        <w:t>which perform fuzz testing on the element under consideration</w:t>
       </w:r>
       <w:r>
         <w:t>.</w:t>
+      </w:r>
+      <w:r>
+        <w:t xml:space="preserve"> The results in the generation of </w:t>
+      </w:r>
+      <w:r>
+        <w:rPr>
+          <w:b/>
+          <w:bCs/>
+        </w:rPr>
+        <w:t>Fuzz Testing Output</w:t>
+      </w:r>
+      <w:r>
+        <w:t>.</w:t>
+      </w:r>
+    </w:p>
+    <w:p>
+      <w:pPr>
+        <w:spacing w:after="240"/>
+        <w:rPr>
+          <w:color w:val="000000" w:themeColor="text1"/>
+        </w:rPr>
+      </w:pPr>
+      <w:r>
+        <w:rPr>
+          <w:b/>
+          <w:bCs/>
+          <w:color w:val="0070C0"/>
+        </w:rPr>
+        <w:t>Note:</w:t>
+      </w:r>
+      <w:r>
+        <w:rPr>
+          <w:color w:val="000000" w:themeColor="text1"/>
+        </w:rPr>
+        <w:tab/>
+        <w:t>This activity may be performed manually.</w:t>
       </w:r>
     </w:p>
     <w:p>
@@ -1412,7 +1787,7 @@
       </w:pPr>
       <w:r>
         <w:lastRenderedPageBreak/>
-        <w:t>Fuzz Testing Findings Triage</w:t>
+        <w:t>Triage</w:t>
       </w:r>
     </w:p>
     <w:tbl>
@@ -1437,7 +1812,6 @@
         <w:tc>
           <w:tcPr>
             <w:tcW w:w="1520" w:type="dxa"/>
-            <w:shd w:val="clear" w:color="auto" w:fill="auto"/>
             <w:tcMar>
               <w:top w:w="100" w:type="dxa"/>
               <w:left w:w="100" w:type="dxa"/>
@@ -1468,7 +1842,6 @@
         <w:tc>
           <w:tcPr>
             <w:tcW w:w="3060" w:type="dxa"/>
-            <w:shd w:val="clear" w:color="auto" w:fill="auto"/>
             <w:tcMar>
               <w:top w:w="100" w:type="dxa"/>
               <w:left w:w="100" w:type="dxa"/>
@@ -1482,7 +1855,10 @@
               <w:spacing w:line="240" w:lineRule="auto"/>
             </w:pPr>
             <w:r>
-              <w:t>Fuzz testing findings</w:t>
+              <w:t xml:space="preserve">Fuzz testing </w:t>
+            </w:r>
+            <w:r>
+              <w:t>output</w:t>
             </w:r>
           </w:p>
         </w:tc>
@@ -1491,7 +1867,6 @@
         <w:tc>
           <w:tcPr>
             <w:tcW w:w="1520" w:type="dxa"/>
-            <w:shd w:val="clear" w:color="auto" w:fill="auto"/>
             <w:tcMar>
               <w:top w:w="100" w:type="dxa"/>
               <w:left w:w="100" w:type="dxa"/>
@@ -1522,7 +1897,6 @@
         <w:tc>
           <w:tcPr>
             <w:tcW w:w="3060" w:type="dxa"/>
-            <w:shd w:val="clear" w:color="auto" w:fill="auto"/>
             <w:tcMar>
               <w:top w:w="100" w:type="dxa"/>
               <w:left w:w="100" w:type="dxa"/>
@@ -1536,7 +1910,7 @@
               <w:spacing w:line="240" w:lineRule="auto"/>
             </w:pPr>
             <w:r>
-              <w:t>Triaged fuzz testing findings</w:t>
+              <w:t>Identified issues</w:t>
             </w:r>
           </w:p>
           <w:p>
@@ -1545,7 +1919,13 @@
               <w:spacing w:line="240" w:lineRule="auto"/>
             </w:pPr>
             <w:r>
-              <w:t>Fuzzing Tool Report</w:t>
+              <w:t>Fuzz</w:t>
+            </w:r>
+            <w:r>
+              <w:t xml:space="preserve"> testing </w:t>
+            </w:r>
+            <w:r>
+              <w:t>Report</w:t>
             </w:r>
           </w:p>
         </w:tc>
@@ -1554,7 +1934,6 @@
         <w:tc>
           <w:tcPr>
             <w:tcW w:w="1520" w:type="dxa"/>
-            <w:shd w:val="clear" w:color="auto" w:fill="auto"/>
             <w:tcMar>
               <w:top w:w="100" w:type="dxa"/>
               <w:left w:w="100" w:type="dxa"/>
@@ -1585,343 +1964,6 @@
         <w:tc>
           <w:tcPr>
             <w:tcW w:w="3060" w:type="dxa"/>
-            <w:shd w:val="clear" w:color="auto" w:fill="auto"/>
-            <w:tcMar>
-              <w:top w:w="100" w:type="dxa"/>
-              <w:left w:w="100" w:type="dxa"/>
-              <w:bottom w:w="100" w:type="dxa"/>
-              <w:right w:w="100" w:type="dxa"/>
-            </w:tcMar>
-          </w:tcPr>
-          <w:p>
-            <w:pPr>
-              <w:widowControl w:val="0"/>
-              <w:spacing w:line="240" w:lineRule="auto"/>
-              <w:rPr>
-                <w:b/>
-                <w:bCs/>
-              </w:rPr>
-            </w:pPr>
-            <w:r>
-              <w:rPr>
-                <w:b/>
-                <w:bCs/>
-              </w:rPr>
-              <w:t>None</w:t>
-            </w:r>
-          </w:p>
-        </w:tc>
-      </w:tr>
-    </w:tbl>
-    <w:p/>
-    <w:p>
-      <w:pPr>
-        <w:jc w:val="center"/>
-      </w:pPr>
-      <w:r>
-        <w:rPr>
-          <w:noProof/>
-        </w:rPr>
-        <w:drawing>
-          <wp:inline distT="0" distB="0" distL="0" distR="0" wp14:anchorId="796AD4E1" wp14:editId="1275C17D">
-            <wp:extent cx="3334327" cy="4384509"/>
-            <wp:effectExtent l="0" t="0" r="6350" b="0"/>
-            <wp:docPr id="10" name="Picture 10" descr="Diagram&#10;&#10;Description automatically generated"/>
-            <wp:cNvGraphicFramePr>
-              <a:graphicFrameLocks xmlns:a="http://schemas.openxmlformats.org/drawingml/2006/main" noChangeAspect="1"/>
-            </wp:cNvGraphicFramePr>
-            <a:graphic xmlns:a="http://schemas.openxmlformats.org/drawingml/2006/main">
-              <a:graphicData uri="http://schemas.openxmlformats.org/drawingml/2006/picture">
-                <pic:pic xmlns:pic="http://schemas.openxmlformats.org/drawingml/2006/picture">
-                  <pic:nvPicPr>
-                    <pic:cNvPr id="10" name="Picture 10" descr="Diagram&#10;&#10;Description automatically generated"/>
-                    <pic:cNvPicPr/>
-                  </pic:nvPicPr>
-                  <pic:blipFill>
-                    <a:blip r:embed="rId12"/>
-                    <a:stretch>
-                      <a:fillRect/>
-                    </a:stretch>
-                  </pic:blipFill>
-                  <pic:spPr>
-                    <a:xfrm>
-                      <a:off x="0" y="0"/>
-                      <a:ext cx="3374758" cy="4437674"/>
-                    </a:xfrm>
-                    <a:prstGeom prst="rect">
-                      <a:avLst/>
-                    </a:prstGeom>
-                  </pic:spPr>
-                </pic:pic>
-              </a:graphicData>
-            </a:graphic>
-          </wp:inline>
-        </w:drawing>
-      </w:r>
-    </w:p>
-    <w:p/>
-    <w:p>
-      <w:pPr>
-        <w:spacing w:after="240"/>
-        <w:jc w:val="both"/>
-      </w:pPr>
-      <w:r>
-        <w:t xml:space="preserve">An automated triage of the </w:t>
-      </w:r>
-      <w:r>
-        <w:rPr>
-          <w:b/>
-          <w:bCs/>
-        </w:rPr>
-        <w:t>Fuzz Testing Findings</w:t>
-      </w:r>
-      <w:r>
-        <w:t xml:space="preserve"> produces a set of </w:t>
-      </w:r>
-      <w:r>
-        <w:rPr>
-          <w:b/>
-          <w:bCs/>
-        </w:rPr>
-        <w:t>Triaged Fuzz Testing Findings</w:t>
-      </w:r>
-      <w:r>
-        <w:t xml:space="preserve">. A </w:t>
-      </w:r>
-      <w:r>
-        <w:rPr>
-          <w:b/>
-          <w:bCs/>
-        </w:rPr>
-        <w:t>Fuzzing Tool Report</w:t>
-      </w:r>
-      <w:r>
-        <w:t xml:space="preserve"> is generated.</w:t>
-      </w:r>
-    </w:p>
-    <w:p>
-      <w:pPr>
-        <w:jc w:val="both"/>
-      </w:pPr>
-      <w:r>
-        <w:t xml:space="preserve">The </w:t>
-      </w:r>
-      <w:r>
-        <w:rPr>
-          <w:b/>
-          <w:bCs/>
-        </w:rPr>
-        <w:t>Fuzzing Tool Report</w:t>
-      </w:r>
-      <w:r>
-        <w:t xml:space="preserve"> includes information such as:</w:t>
-      </w:r>
-    </w:p>
-    <w:p>
-      <w:pPr>
-        <w:pStyle w:val="ListParagraph"/>
-        <w:numPr>
-          <w:ilvl w:val="0"/>
-          <w:numId w:val="6"/>
-        </w:numPr>
-        <w:ind w:left="360"/>
-        <w:jc w:val="both"/>
-      </w:pPr>
-      <w:r>
-        <w:t>harnesses executed</w:t>
-      </w:r>
-    </w:p>
-    <w:p>
-      <w:pPr>
-        <w:pStyle w:val="ListParagraph"/>
-        <w:numPr>
-          <w:ilvl w:val="0"/>
-          <w:numId w:val="6"/>
-        </w:numPr>
-        <w:ind w:left="360"/>
-        <w:jc w:val="both"/>
-      </w:pPr>
-      <w:r>
-        <w:t>duration of fuzzing</w:t>
-      </w:r>
-    </w:p>
-    <w:p>
-      <w:pPr>
-        <w:pStyle w:val="ListParagraph"/>
-        <w:numPr>
-          <w:ilvl w:val="0"/>
-          <w:numId w:val="6"/>
-        </w:numPr>
-        <w:ind w:left="360"/>
-        <w:jc w:val="both"/>
-      </w:pPr>
-      <w:r>
-        <w:t>defects found</w:t>
-      </w:r>
-    </w:p>
-    <w:p>
-      <w:pPr>
-        <w:pStyle w:val="ListParagraph"/>
-        <w:numPr>
-          <w:ilvl w:val="0"/>
-          <w:numId w:val="6"/>
-        </w:numPr>
-        <w:ind w:left="360"/>
-        <w:jc w:val="both"/>
-      </w:pPr>
-      <w:r>
-        <w:t>defect classification</w:t>
-      </w:r>
-    </w:p>
-    <w:p>
-      <w:pPr>
-        <w:rPr>
-          <w:sz w:val="32"/>
-          <w:szCs w:val="32"/>
-        </w:rPr>
-      </w:pPr>
-      <w:r>
-        <w:br w:type="page"/>
-      </w:r>
-    </w:p>
-    <w:p>
-      <w:pPr>
-        <w:pStyle w:val="Heading2"/>
-      </w:pPr>
-      <w:r>
-        <w:lastRenderedPageBreak/>
-        <w:t>Analysis</w:t>
-      </w:r>
-    </w:p>
-    <w:tbl>
-      <w:tblPr>
-        <w:tblW w:w="4490" w:type="dxa"/>
-        <w:tblBorders>
-          <w:top w:val="single" w:sz="8" w:space="0" w:color="000000"/>
-          <w:left w:val="single" w:sz="8" w:space="0" w:color="000000"/>
-          <w:bottom w:val="single" w:sz="8" w:space="0" w:color="000000"/>
-          <w:right w:val="single" w:sz="8" w:space="0" w:color="000000"/>
-          <w:insideH w:val="single" w:sz="8" w:space="0" w:color="000000"/>
-          <w:insideV w:val="single" w:sz="8" w:space="0" w:color="000000"/>
-        </w:tblBorders>
-        <w:tblLayout w:type="fixed"/>
-        <w:tblLook w:val="0600" w:firstRow="0" w:lastRow="0" w:firstColumn="0" w:lastColumn="0" w:noHBand="1" w:noVBand="1"/>
-      </w:tblPr>
-      <w:tblGrid>
-        <w:gridCol w:w="1520"/>
-        <w:gridCol w:w="2970"/>
-      </w:tblGrid>
-      <w:tr>
-        <w:tc>
-          <w:tcPr>
-            <w:tcW w:w="1520" w:type="dxa"/>
-            <w:shd w:val="clear" w:color="auto" w:fill="auto"/>
-            <w:tcMar>
-              <w:top w:w="100" w:type="dxa"/>
-              <w:left w:w="100" w:type="dxa"/>
-              <w:bottom w:w="100" w:type="dxa"/>
-              <w:right w:w="100" w:type="dxa"/>
-            </w:tcMar>
-            <w:vAlign w:val="center"/>
-          </w:tcPr>
-          <w:p>
-            <w:pPr>
-              <w:widowControl w:val="0"/>
-              <w:pBdr>
-                <w:top w:val="nil"/>
-                <w:left w:val="nil"/>
-                <w:bottom w:val="nil"/>
-                <w:right w:val="nil"/>
-                <w:between w:val="nil"/>
-              </w:pBdr>
-              <w:spacing w:line="240" w:lineRule="auto"/>
-              <w:jc w:val="right"/>
-              <w:rPr>
-                <w:b/>
-                <w:bCs/>
-              </w:rPr>
-            </w:pPr>
-            <w:r>
-              <w:rPr>
-                <w:b/>
-                <w:bCs/>
-              </w:rPr>
-              <w:t>Inputs</w:t>
-            </w:r>
-          </w:p>
-        </w:tc>
-        <w:tc>
-          <w:tcPr>
-            <w:tcW w:w="2970" w:type="dxa"/>
-            <w:shd w:val="clear" w:color="auto" w:fill="auto"/>
-            <w:tcMar>
-              <w:top w:w="100" w:type="dxa"/>
-              <w:left w:w="100" w:type="dxa"/>
-              <w:bottom w:w="100" w:type="dxa"/>
-              <w:right w:w="100" w:type="dxa"/>
-            </w:tcMar>
-          </w:tcPr>
-          <w:p>
-            <w:pPr>
-              <w:widowControl w:val="0"/>
-              <w:pBdr>
-                <w:top w:val="nil"/>
-                <w:left w:val="nil"/>
-                <w:bottom w:val="nil"/>
-                <w:right w:val="nil"/>
-                <w:between w:val="nil"/>
-              </w:pBdr>
-              <w:spacing w:line="240" w:lineRule="auto"/>
-            </w:pPr>
-            <w:r>
-              <w:t>Triaged fuzz testing findings</w:t>
-            </w:r>
-          </w:p>
-        </w:tc>
-      </w:tr>
-      <w:tr>
-        <w:tc>
-          <w:tcPr>
-            <w:tcW w:w="1520" w:type="dxa"/>
-            <w:shd w:val="clear" w:color="auto" w:fill="auto"/>
-            <w:tcMar>
-              <w:top w:w="100" w:type="dxa"/>
-              <w:left w:w="100" w:type="dxa"/>
-              <w:bottom w:w="100" w:type="dxa"/>
-              <w:right w:w="100" w:type="dxa"/>
-            </w:tcMar>
-            <w:vAlign w:val="center"/>
-          </w:tcPr>
-          <w:p>
-            <w:pPr>
-              <w:widowControl w:val="0"/>
-              <w:pBdr>
-                <w:top w:val="nil"/>
-                <w:left w:val="nil"/>
-                <w:bottom w:val="nil"/>
-                <w:right w:val="nil"/>
-                <w:between w:val="nil"/>
-              </w:pBdr>
-              <w:spacing w:line="240" w:lineRule="auto"/>
-              <w:jc w:val="right"/>
-              <w:rPr>
-                <w:b/>
-                <w:bCs/>
-              </w:rPr>
-            </w:pPr>
-            <w:r>
-              <w:rPr>
-                <w:b/>
-                <w:bCs/>
-              </w:rPr>
-              <w:t>Outputs</w:t>
-            </w:r>
-          </w:p>
-        </w:tc>
-        <w:tc>
-          <w:tcPr>
-            <w:tcW w:w="2970" w:type="dxa"/>
-            <w:shd w:val="clear" w:color="auto" w:fill="auto"/>
             <w:tcMar>
               <w:top w:w="100" w:type="dxa"/>
               <w:left w:w="100" w:type="dxa"/>
@@ -1935,94 +1977,16 @@
               <w:spacing w:line="240" w:lineRule="auto"/>
             </w:pPr>
             <w:r>
-              <w:t>Identified issues</w:t>
+              <w:t>Fuzz Testing SME</w:t>
             </w:r>
           </w:p>
           <w:p>
             <w:pPr>
               <w:widowControl w:val="0"/>
-              <w:pBdr>
-                <w:top w:val="nil"/>
-                <w:left w:val="nil"/>
-                <w:bottom w:val="nil"/>
-                <w:right w:val="nil"/>
-                <w:between w:val="nil"/>
-              </w:pBdr>
               <w:spacing w:line="240" w:lineRule="auto"/>
             </w:pPr>
             <w:r>
-              <w:t>Fuzz Testing Report</w:t>
-            </w:r>
-          </w:p>
-        </w:tc>
-      </w:tr>
-      <w:tr>
-        <w:tc>
-          <w:tcPr>
-            <w:tcW w:w="1520" w:type="dxa"/>
-            <w:shd w:val="clear" w:color="auto" w:fill="auto"/>
-            <w:tcMar>
-              <w:top w:w="100" w:type="dxa"/>
-              <w:left w:w="100" w:type="dxa"/>
-              <w:bottom w:w="100" w:type="dxa"/>
-              <w:right w:w="100" w:type="dxa"/>
-            </w:tcMar>
-            <w:vAlign w:val="center"/>
-          </w:tcPr>
-          <w:p>
-            <w:pPr>
-              <w:widowControl w:val="0"/>
-              <w:pBdr>
-                <w:top w:val="nil"/>
-                <w:left w:val="nil"/>
-                <w:bottom w:val="nil"/>
-                <w:right w:val="nil"/>
-                <w:between w:val="nil"/>
-              </w:pBdr>
-              <w:spacing w:line="240" w:lineRule="auto"/>
-              <w:jc w:val="right"/>
-              <w:rPr>
-                <w:b/>
-                <w:bCs/>
-              </w:rPr>
-            </w:pPr>
-            <w:r>
-              <w:rPr>
-                <w:b/>
-                <w:bCs/>
-              </w:rPr>
-              <w:t>Participants</w:t>
-            </w:r>
-          </w:p>
-        </w:tc>
-        <w:tc>
-          <w:tcPr>
-            <w:tcW w:w="2970" w:type="dxa"/>
-            <w:shd w:val="clear" w:color="auto" w:fill="auto"/>
-            <w:tcMar>
-              <w:top w:w="100" w:type="dxa"/>
-              <w:left w:w="100" w:type="dxa"/>
-              <w:bottom w:w="100" w:type="dxa"/>
-              <w:right w:w="100" w:type="dxa"/>
-            </w:tcMar>
-          </w:tcPr>
-          <w:p>
-            <w:pPr>
-              <w:widowControl w:val="0"/>
-              <w:pBdr>
-                <w:top w:val="nil"/>
-                <w:left w:val="nil"/>
-                <w:bottom w:val="nil"/>
-                <w:right w:val="nil"/>
-                <w:between w:val="nil"/>
-              </w:pBdr>
-              <w:spacing w:line="240" w:lineRule="auto"/>
-            </w:pPr>
-            <w:r>
-              <w:t>Fuzz Testing</w:t>
-            </w:r>
-            <w:r>
-              <w:t xml:space="preserve"> SME</w:t>
+              <w:t>Development SME</w:t>
             </w:r>
           </w:p>
         </w:tc>
@@ -2038,10 +2002,10 @@
           <w:noProof/>
         </w:rPr>
         <w:drawing>
-          <wp:inline distT="0" distB="0" distL="0" distR="0" wp14:anchorId="79DDDA07" wp14:editId="26352FA0">
-            <wp:extent cx="5262976" cy="4387273"/>
-            <wp:effectExtent l="0" t="0" r="0" b="0"/>
-            <wp:docPr id="1" name="Picture 1"/>
+          <wp:inline distT="0" distB="0" distL="0" distR="0" wp14:anchorId="796AD4E1" wp14:editId="6F3CB535">
+            <wp:extent cx="5144662" cy="4390930"/>
+            <wp:effectExtent l="0" t="0" r="0" b="3810"/>
+            <wp:docPr id="10" name="Picture 10"/>
             <wp:cNvGraphicFramePr>
               <a:graphicFrameLocks xmlns:a="http://schemas.openxmlformats.org/drawingml/2006/main" noChangeAspect="1"/>
             </wp:cNvGraphicFramePr>
@@ -2049,11 +2013,11 @@
               <a:graphicData uri="http://schemas.openxmlformats.org/drawingml/2006/picture">
                 <pic:pic xmlns:pic="http://schemas.openxmlformats.org/drawingml/2006/picture">
                   <pic:nvPicPr>
-                    <pic:cNvPr id="1" name="Picture 1"/>
+                    <pic:cNvPr id="10" name="Picture 10"/>
                     <pic:cNvPicPr/>
                   </pic:nvPicPr>
                   <pic:blipFill>
-                    <a:blip r:embed="rId13">
+                    <a:blip r:embed="rId12" cstate="print">
                       <a:extLst>
                         <a:ext uri="{28A0092B-C50C-407E-A947-70E740481C1C}">
                           <a14:useLocalDpi xmlns:a14="http://schemas.microsoft.com/office/drawing/2010/main" val="0"/>
@@ -2067,7 +2031,7 @@
                   <pic:spPr>
                     <a:xfrm>
                       <a:off x="0" y="0"/>
-                      <a:ext cx="5264466" cy="4388515"/>
+                      <a:ext cx="5203001" cy="4440722"/>
                     </a:xfrm>
                     <a:prstGeom prst="rect">
                       <a:avLst/>
@@ -2087,33 +2051,72 @@
         <w:jc w:val="both"/>
       </w:pPr>
       <w:r>
-        <w:t xml:space="preserve">The Fuzz Testing SME analyzes the </w:t>
-      </w:r>
-      <w:r>
-        <w:rPr>
-          <w:b/>
-          <w:bCs/>
-        </w:rPr>
-        <w:t>Triaged Fuzz Testing Findings</w:t>
-      </w:r>
-      <w:r>
-        <w:t xml:space="preserve"> and attempts to reproduce the issues on the current software. Reproducible issues are collected into a set of </w:t>
-      </w:r>
-      <w:r>
-        <w:rPr>
-          <w:b/>
-          <w:bCs/>
-        </w:rPr>
-        <w:t>Identified Issues</w:t>
-      </w:r>
-      <w:r>
-        <w:t xml:space="preserve"> and submit</w:t>
-      </w:r>
-      <w:r>
-        <w:t>ted</w:t>
-      </w:r>
-      <w:r>
-        <w:t xml:space="preserve"> to the issue tracking system.</w:t>
+        <w:t xml:space="preserve">The </w:t>
+      </w:r>
+      <w:r>
+        <w:rPr>
+          <w:b/>
+          <w:bCs/>
+        </w:rPr>
+        <w:t>Fuzz Testing SME</w:t>
+      </w:r>
+      <w:r>
+        <w:t xml:space="preserve"> </w:t>
+      </w:r>
+      <w:r>
+        <w:t xml:space="preserve">and </w:t>
+      </w:r>
+      <w:r>
+        <w:rPr>
+          <w:b/>
+          <w:bCs/>
+        </w:rPr>
+        <w:t>Development SME</w:t>
+      </w:r>
+      <w:r>
+        <w:t xml:space="preserve"> review</w:t>
+      </w:r>
+      <w:r>
+        <w:t xml:space="preserve"> the </w:t>
+      </w:r>
+      <w:r>
+        <w:rPr>
+          <w:b/>
+          <w:bCs/>
+        </w:rPr>
+        <w:t>Fuzz Testing Output</w:t>
+      </w:r>
+      <w:r>
+        <w:t xml:space="preserve"> </w:t>
+      </w:r>
+      <w:r>
+        <w:t>to identify any anomalous behavior needing further investigation</w:t>
+      </w:r>
+      <w:r>
+        <w:t>.</w:t>
+      </w:r>
+      <w:r>
+        <w:t xml:space="preserve"> A </w:t>
+      </w:r>
+      <w:r>
+        <w:rPr>
+          <w:b/>
+          <w:bCs/>
+        </w:rPr>
+        <w:t>Triaged Issues</w:t>
+      </w:r>
+      <w:r>
+        <w:t xml:space="preserve"> list is created, and a </w:t>
+      </w:r>
+      <w:r>
+        <w:rPr>
+          <w:b/>
+          <w:bCs/>
+        </w:rPr>
+        <w:t>Fuzz Testing Report</w:t>
+      </w:r>
+      <w:r>
+        <w:t xml:space="preserve"> is generated.</w:t>
       </w:r>
     </w:p>
     <w:p>
@@ -2122,21 +2125,14 @@
         <w:jc w:val="both"/>
       </w:pPr>
       <w:r>
-        <w:t xml:space="preserve">Findings are summarized in a </w:t>
-      </w:r>
-      <w:r>
-        <w:rPr>
-          <w:b/>
-          <w:bCs/>
-        </w:rPr>
-        <w:t>Fuzz Testing Report</w:t>
-      </w:r>
-      <w:r>
-        <w:rPr>
-          <w:b/>
-          <w:bCs/>
-        </w:rPr>
-        <w:t xml:space="preserve"> </w:t>
+        <w:t xml:space="preserve">Issues requiring further review are passed along to the </w:t>
+      </w:r>
+      <w:r>
+        <w:rPr>
+          <w:b/>
+          <w:bCs/>
+        </w:rPr>
+        <w:t xml:space="preserve">Threat Prioritization Process </w:t>
       </w:r>
       <w:r>
         <w:rPr>
@@ -2145,7 +2141,118 @@
           <w:color w:val="0070C0"/>
           <w:vertAlign w:val="superscript"/>
         </w:rPr>
-        <w:t>[</w:t>
+        <w:t>[3]</w:t>
+      </w:r>
+      <w:r>
+        <w:t xml:space="preserve">. Issued determined to require immediate attention are entered directly into the </w:t>
+      </w:r>
+      <w:r>
+        <w:rPr>
+          <w:b/>
+          <w:bCs/>
+        </w:rPr>
+        <w:t>Issue Tracking System</w:t>
+      </w:r>
+      <w:r>
+        <w:t>.</w:t>
+      </w:r>
+    </w:p>
+    <w:p>
+      <w:pPr>
+        <w:spacing w:after="240"/>
+        <w:jc w:val="both"/>
+      </w:pPr>
+      <w:r>
+        <w:t xml:space="preserve">Rejected issues should be addressed by updating the </w:t>
+      </w:r>
+      <w:r>
+        <w:rPr>
+          <w:b/>
+          <w:bCs/>
+        </w:rPr>
+        <w:t xml:space="preserve">Element </w:t>
+      </w:r>
+      <w:r>
+        <w:rPr>
+          <w:b/>
+          <w:bCs/>
+        </w:rPr>
+        <w:t xml:space="preserve">Fuzz </w:t>
+      </w:r>
+      <w:r>
+        <w:rPr>
+          <w:b/>
+          <w:bCs/>
+        </w:rPr>
+        <w:t>Test</w:t>
+      </w:r>
+      <w:r>
+        <w:t>.</w:t>
+      </w:r>
+      <w:r>
+        <w:br w:type="page"/>
+      </w:r>
+    </w:p>
+    <w:p>
+      <w:pPr>
+        <w:pStyle w:val="Heading3"/>
+      </w:pPr>
+      <w:r>
+        <w:lastRenderedPageBreak/>
+        <w:t>Triaged</w:t>
+      </w:r>
+      <w:r>
+        <w:t xml:space="preserve"> Issues</w:t>
+      </w:r>
+    </w:p>
+    <w:p>
+      <w:pPr>
+        <w:jc w:val="both"/>
+      </w:pPr>
+      <w:r>
+        <w:t xml:space="preserve">The recommended form of the </w:t>
+      </w:r>
+      <w:r>
+        <w:rPr>
+          <w:b/>
+          <w:bCs/>
+        </w:rPr>
+        <w:t>triaged</w:t>
+      </w:r>
+      <w:r>
+        <w:rPr>
+          <w:b/>
+          <w:bCs/>
+        </w:rPr>
+        <w:t xml:space="preserve"> Issues</w:t>
+      </w:r>
+      <w:r>
+        <w:t xml:space="preserve"> artifact </w:t>
+      </w:r>
+      <w:r>
+        <w:t xml:space="preserve">is a </w:t>
+      </w:r>
+      <w:r>
+        <w:t>SARIF</w:t>
+      </w:r>
+      <w:r>
+        <w:rPr>
+          <w:b/>
+          <w:bCs/>
+        </w:rPr>
+        <w:t>-</w:t>
+      </w:r>
+      <w:r>
+        <w:t xml:space="preserve">encoded </w:t>
+      </w:r>
+      <w:r>
+        <w:t>JSON.</w:t>
+      </w:r>
+      <w:r>
+        <w:t xml:space="preserve"> </w:t>
+      </w:r>
+      <w:r>
+        <w:t xml:space="preserve">This document assumes SARIF version 2.1.0 </w:t>
       </w:r>
       <w:r>
         <w:rPr>
@@ -2154,7 +2261,7 @@
           <w:color w:val="0070C0"/>
           <w:vertAlign w:val="superscript"/>
         </w:rPr>
-        <w:t>2</w:t>
+        <w:t>[</w:t>
       </w:r>
       <w:r>
         <w:rPr>
@@ -2163,71 +2270,7 @@
           <w:color w:val="0070C0"/>
           <w:vertAlign w:val="superscript"/>
         </w:rPr>
-        <w:t>]</w:t>
-      </w:r>
-      <w:r>
-        <w:t xml:space="preserve">. The </w:t>
-      </w:r>
-      <w:r>
-        <w:rPr>
-          <w:b/>
-          <w:bCs/>
-        </w:rPr>
-        <w:t>Fuzz Testing Plan</w:t>
-      </w:r>
-      <w:r>
-        <w:t xml:space="preserve"> is updated based on issues found</w:t>
-      </w:r>
-      <w:r>
-        <w:t>.</w:t>
-      </w:r>
-    </w:p>
-    <w:p>
-      <w:pPr>
-        <w:pStyle w:val="Heading3"/>
-      </w:pPr>
-      <w:r>
-        <w:t>Identified Issues</w:t>
-      </w:r>
-    </w:p>
-    <w:p>
-      <w:pPr>
-        <w:jc w:val="both"/>
-      </w:pPr>
-      <w:r>
-        <w:t xml:space="preserve">The recommended form of the </w:t>
-      </w:r>
-      <w:r>
-        <w:rPr>
-          <w:b/>
-          <w:bCs/>
-        </w:rPr>
-        <w:t>Identified Issues</w:t>
-      </w:r>
-      <w:r>
-        <w:t xml:space="preserve"> artifact </w:t>
-      </w:r>
-      <w:r>
-        <w:t>is a Static Analysis Results Interchange Format (</w:t>
-      </w:r>
-      <w:r>
-        <w:rPr>
-          <w:b/>
-          <w:bCs/>
-        </w:rPr>
-        <w:t>SARIF</w:t>
-      </w:r>
-      <w:r>
-        <w:t xml:space="preserve">) encoded </w:t>
-      </w:r>
-      <w:r>
-        <w:t>JSON.</w:t>
-      </w:r>
-      <w:r>
-        <w:t xml:space="preserve"> </w:t>
-      </w:r>
-      <w:r>
-        <w:t xml:space="preserve">This document assumes SARIF version 2.1.0 </w:t>
+        <w:t>5</w:t>
       </w:r>
       <w:r>
         <w:rPr>
@@ -2236,24 +2279,6 @@
           <w:color w:val="0070C0"/>
           <w:vertAlign w:val="superscript"/>
         </w:rPr>
-        <w:t>[</w:t>
-      </w:r>
-      <w:r>
-        <w:rPr>
-          <w:b/>
-          <w:bCs/>
-          <w:color w:val="0070C0"/>
-          <w:vertAlign w:val="superscript"/>
-        </w:rPr>
-        <w:t>6</w:t>
-      </w:r>
-      <w:r>
-        <w:rPr>
-          <w:b/>
-          <w:bCs/>
-          <w:color w:val="0070C0"/>
-          <w:vertAlign w:val="superscript"/>
-        </w:rPr>
         <w:t xml:space="preserve">] </w:t>
       </w:r>
       <w:r>
@@ -2265,7 +2290,6 @@
         <w:pStyle w:val="Heading3"/>
       </w:pPr>
       <w:r>
-        <w:lastRenderedPageBreak/>
         <w:t>Fuzz Testing Report</w:t>
       </w:r>
     </w:p>
@@ -2289,35 +2313,33 @@
           <w:sz w:val="22"/>
           <w:szCs w:val="22"/>
         </w:rPr>
-        <w:t xml:space="preserve">The </w:t>
-      </w:r>
-      <w:r>
-        <w:rPr>
-          <w:b/>
-          <w:bCs/>
+        <w:t>The</w:t>
+      </w:r>
+      <w:r>
+        <w:rPr>
           <w:color w:val="000000" w:themeColor="text1"/>
           <w:sz w:val="22"/>
           <w:szCs w:val="22"/>
         </w:rPr>
-        <w:t>Fuzz Testing</w:t>
-      </w:r>
-      <w:r>
-        <w:rPr>
-          <w:b/>
-          <w:bCs/>
+        <w:t xml:space="preserve"> human-readable</w:t>
+      </w:r>
+      <w:r>
+        <w:rPr>
           <w:color w:val="000000" w:themeColor="text1"/>
           <w:sz w:val="22"/>
           <w:szCs w:val="22"/>
         </w:rPr>
-        <w:t xml:space="preserve"> Report</w:t>
-      </w:r>
-      <w:r>
-        <w:rPr>
+        <w:t xml:space="preserve"> </w:t>
+      </w:r>
+      <w:r>
+        <w:rPr>
+          <w:b/>
+          <w:bCs/>
           <w:color w:val="000000" w:themeColor="text1"/>
           <w:sz w:val="22"/>
           <w:szCs w:val="22"/>
         </w:rPr>
-        <w:t xml:space="preserve"> is recommended to be produced from the </w:t>
+        <w:t>Fuzz Testing</w:t>
       </w:r>
       <w:r>
         <w:rPr>
@@ -2327,7 +2349,35 @@
           <w:sz w:val="22"/>
           <w:szCs w:val="22"/>
         </w:rPr>
-        <w:t>Identified Issues</w:t>
+        <w:t xml:space="preserve"> Report</w:t>
+      </w:r>
+      <w:r>
+        <w:rPr>
+          <w:color w:val="000000" w:themeColor="text1"/>
+          <w:sz w:val="22"/>
+          <w:szCs w:val="22"/>
+        </w:rPr>
+        <w:t xml:space="preserve"> is recommended to be produced from the </w:t>
+      </w:r>
+      <w:r>
+        <w:rPr>
+          <w:b/>
+          <w:bCs/>
+          <w:color w:val="000000" w:themeColor="text1"/>
+          <w:sz w:val="22"/>
+          <w:szCs w:val="22"/>
+        </w:rPr>
+        <w:t>triaged</w:t>
+      </w:r>
+      <w:r>
+        <w:rPr>
+          <w:b/>
+          <w:bCs/>
+          <w:color w:val="000000" w:themeColor="text1"/>
+          <w:sz w:val="22"/>
+          <w:szCs w:val="22"/>
+        </w:rPr>
+        <w:t xml:space="preserve"> Issues</w:t>
       </w:r>
       <w:r>
         <w:rPr>
@@ -2778,6 +2828,7 @@
           <w:bCs/>
           <w:color w:val="0070C0"/>
         </w:rPr>
+        <w:lastRenderedPageBreak/>
         <w:t>Note:</w:t>
       </w:r>
       <w:r>
@@ -2786,19 +2837,6 @@
         </w:rPr>
         <w:tab/>
         <w:t>The above information is directly provided for by the SARIF specification.</w:t>
-      </w:r>
-    </w:p>
-    <w:p>
-      <w:pPr>
-        <w:rPr>
-          <w:color w:val="000000" w:themeColor="text1"/>
-        </w:rPr>
-      </w:pPr>
-      <w:r>
-        <w:rPr>
-          <w:color w:val="000000" w:themeColor="text1"/>
-        </w:rPr>
-        <w:br w:type="page"/>
       </w:r>
     </w:p>
     <w:p>
@@ -2820,7 +2858,6 @@
           <w:sz w:val="22"/>
           <w:szCs w:val="22"/>
         </w:rPr>
-        <w:lastRenderedPageBreak/>
         <w:t>It is recommended to include the</w:t>
       </w:r>
       <w:r>
@@ -2845,7 +2882,23 @@
           <w:sz w:val="22"/>
           <w:szCs w:val="22"/>
         </w:rPr>
-        <w:t xml:space="preserve">fuzzing-specific </w:t>
+        <w:t>fuzz</w:t>
+      </w:r>
+      <w:r>
+        <w:rPr>
+          <w:color w:val="000000" w:themeColor="text1"/>
+          <w:sz w:val="22"/>
+          <w:szCs w:val="22"/>
+        </w:rPr>
+        <w:t xml:space="preserve"> test</w:t>
+      </w:r>
+      <w:r>
+        <w:rPr>
+          <w:color w:val="000000" w:themeColor="text1"/>
+          <w:sz w:val="22"/>
+          <w:szCs w:val="22"/>
+        </w:rPr>
+        <w:t xml:space="preserve">ing-specific </w:t>
       </w:r>
       <w:r>
         <w:rPr>
@@ -3047,9 +3100,24 @@
           <w:sz w:val="22"/>
           <w:szCs w:val="22"/>
         </w:rPr>
-        <w:t>namespace to denote fuzzing (</w:t>
-      </w:r>
-      <w:proofErr w:type="gramStart"/>
+        <w:t>namespace to denote fuzz</w:t>
+      </w:r>
+      <w:r>
+        <w:rPr>
+          <w:color w:val="000000" w:themeColor="text1"/>
+          <w:sz w:val="22"/>
+          <w:szCs w:val="22"/>
+        </w:rPr>
+        <w:t xml:space="preserve"> test</w:t>
+      </w:r>
+      <w:r>
+        <w:rPr>
+          <w:color w:val="000000" w:themeColor="text1"/>
+          <w:sz w:val="22"/>
+          <w:szCs w:val="22"/>
+        </w:rPr>
+        <w:t>ing (</w:t>
+      </w:r>
       <w:r>
         <w:rPr>
           <w:rFonts w:ascii="Courier New" w:hAnsi="Courier New" w:cs="Courier New"/>
@@ -3072,7 +3140,6 @@
         </w:rPr>
         <w:t>::</w:t>
       </w:r>
-      <w:proofErr w:type="gramEnd"/>
       <w:r>
         <w:rPr>
           <w:rFonts w:ascii="Courier New" w:hAnsi="Courier New" w:cs="Courier New"/>
@@ -3093,6 +3160,101 @@
           <w:szCs w:val="22"/>
         </w:rPr>
         <w:t>) is recommended.</w:t>
+      </w:r>
+    </w:p>
+    <w:p>
+      <w:pPr>
+        <w:pStyle w:val="Heading1"/>
+        <w:keepNext w:val="0"/>
+        <w:keepLines w:val="0"/>
+        <w:suppressLineNumbers/>
+        <w:spacing w:before="0" w:line="240" w:lineRule="auto"/>
+        <w:ind w:left="720" w:hanging="720"/>
+        <w:rPr>
+          <w:color w:val="000000" w:themeColor="text1"/>
+          <w:sz w:val="22"/>
+          <w:szCs w:val="22"/>
+        </w:rPr>
+      </w:pPr>
+      <w:r>
+        <w:rPr>
+          <w:b/>
+          <w:bCs/>
+          <w:color w:val="0070C0"/>
+          <w:sz w:val="22"/>
+          <w:szCs w:val="22"/>
+        </w:rPr>
+        <w:t>Note:</w:t>
+      </w:r>
+      <w:r>
+        <w:rPr>
+          <w:color w:val="000000" w:themeColor="text1"/>
+          <w:sz w:val="22"/>
+          <w:szCs w:val="22"/>
+        </w:rPr>
+        <w:tab/>
+        <w:t xml:space="preserve">Details on the generation of reports is covered in the </w:t>
+      </w:r>
+      <w:r>
+        <w:rPr>
+          <w:b/>
+          <w:bCs/>
+          <w:color w:val="000000" w:themeColor="text1"/>
+          <w:sz w:val="22"/>
+          <w:szCs w:val="22"/>
+        </w:rPr>
+        <w:t>Report Generation</w:t>
+      </w:r>
+      <w:r>
+        <w:rPr>
+          <w:b/>
+          <w:bCs/>
+          <w:color w:val="000000" w:themeColor="text1"/>
+          <w:sz w:val="22"/>
+          <w:szCs w:val="22"/>
+        </w:rPr>
+        <w:t xml:space="preserve"> </w:t>
+      </w:r>
+      <w:r>
+        <w:rPr>
+          <w:b/>
+          <w:bCs/>
+          <w:color w:val="0070C0"/>
+          <w:sz w:val="22"/>
+          <w:szCs w:val="22"/>
+          <w:vertAlign w:val="superscript"/>
+        </w:rPr>
+        <w:t>[</w:t>
+      </w:r>
+      <w:r>
+        <w:rPr>
+          <w:b/>
+          <w:bCs/>
+          <w:color w:val="0070C0"/>
+          <w:sz w:val="22"/>
+          <w:szCs w:val="22"/>
+          <w:vertAlign w:val="superscript"/>
+        </w:rPr>
+        <w:t>6</w:t>
+      </w:r>
+      <w:r>
+        <w:rPr>
+          <w:b/>
+          <w:bCs/>
+          <w:color w:val="0070C0"/>
+          <w:sz w:val="22"/>
+          <w:szCs w:val="22"/>
+          <w:vertAlign w:val="superscript"/>
+        </w:rPr>
+        <w:t>]</w:t>
+      </w:r>
+      <w:r>
+        <w:rPr>
+          <w:color w:val="000000" w:themeColor="text1"/>
+          <w:sz w:val="22"/>
+          <w:szCs w:val="22"/>
+        </w:rPr>
+        <w:t xml:space="preserve"> AVCDL elaboration document.</w:t>
       </w:r>
     </w:p>
     <w:p>
@@ -3151,6 +3313,48 @@
       </w:r>
       <w:r>
         <w:rPr>
+          <w:color w:val="000000" w:themeColor="text1"/>
+        </w:rPr>
+        <w:br/>
+      </w:r>
+      <w:hyperlink r:id="rId13" w:history="1">
+        <w:r>
+          <w:rPr>
+            <w:rStyle w:val="Hyperlink"/>
+            <w:rFonts w:ascii="Courier New" w:hAnsi="Courier New" w:cs="Courier New"/>
+            <w:b/>
+            <w:bCs/>
+            <w:sz w:val="20"/>
+            <w:szCs w:val="20"/>
+          </w:rPr>
+          <w:t>https://cwe.mitre.org/</w:t>
+        </w:r>
+      </w:hyperlink>
+    </w:p>
+    <w:p>
+      <w:pPr>
+        <w:pStyle w:val="ListParagraph"/>
+        <w:numPr>
+          <w:ilvl w:val="0"/>
+          <w:numId w:val="1"/>
+        </w:numPr>
+        <w:ind w:left="360"/>
+        <w:rPr>
+          <w:color w:val="000000" w:themeColor="text1"/>
+        </w:rPr>
+      </w:pPr>
+      <w:r>
+        <w:rPr>
+          <w:b/>
+          <w:bCs/>
+          <w:color w:val="000000" w:themeColor="text1"/>
+        </w:rPr>
+        <w:t>Fuzzing</w:t>
+      </w:r>
+      <w:r>
+        <w:rPr>
+          <w:b/>
+          <w:bCs/>
           <w:color w:val="000000" w:themeColor="text1"/>
         </w:rPr>
         <w:br/>
@@ -3162,8 +3366,10 @@
             <w:rFonts w:ascii="Courier New" w:hAnsi="Courier New" w:cs="Courier New"/>
             <w:b/>
             <w:bCs/>
+            <w:sz w:val="21"/>
+            <w:szCs w:val="21"/>
           </w:rPr>
-          <w:t>https://cwe.mitre.org/</w:t>
+          <w:t>https://en.wikipedia.org/wiki/Fuzzing</w:t>
         </w:r>
       </w:hyperlink>
     </w:p>
@@ -3185,10 +3391,12 @@
           <w:bCs/>
           <w:color w:val="000000" w:themeColor="text1"/>
         </w:rPr>
-        <w:t>Fuzzing for Software Security Testing and Quality Assurance</w:t>
-      </w:r>
-      <w:r>
-        <w:rPr>
+        <w:t>Threat Prioritization Process</w:t>
+      </w:r>
+      <w:r>
+        <w:rPr>
+          <w:b/>
+          <w:bCs/>
           <w:color w:val="000000" w:themeColor="text1"/>
         </w:rPr>
         <w:t xml:space="preserve"> </w:t>
@@ -3197,19 +3405,19 @@
         <w:rPr>
           <w:color w:val="000000" w:themeColor="text1"/>
         </w:rPr>
-        <w:t>(</w:t>
-      </w:r>
-      <w:r>
-        <w:rPr>
-          <w:color w:val="000000" w:themeColor="text1"/>
-        </w:rPr>
-        <w:t>Takanen, Demott, and Miller</w:t>
-      </w:r>
-      <w:r>
-        <w:rPr>
-          <w:color w:val="000000" w:themeColor="text1"/>
-        </w:rPr>
-        <w:t>)</w:t>
+        <w:t xml:space="preserve">(AVCDL </w:t>
+      </w:r>
+      <w:r>
+        <w:rPr>
+          <w:color w:val="000000" w:themeColor="text1"/>
+        </w:rPr>
+        <w:t>secondary</w:t>
+      </w:r>
+      <w:r>
+        <w:rPr>
+          <w:color w:val="000000" w:themeColor="text1"/>
+        </w:rPr>
+        <w:t xml:space="preserve"> document)</w:t>
       </w:r>
     </w:p>
     <w:p>
@@ -3230,13 +3438,33 @@
           <w:bCs/>
           <w:color w:val="000000" w:themeColor="text1"/>
         </w:rPr>
-        <w:t xml:space="preserve">Fuzz Testing Report </w:t>
-      </w:r>
-      <w:r>
-        <w:rPr>
-          <w:color w:val="000000" w:themeColor="text1"/>
-        </w:rPr>
-        <w:t>(AVCDL tertiary document)</w:t>
+        <w:t>Secure Settings Document</w:t>
+      </w:r>
+      <w:r>
+        <w:rPr>
+          <w:b/>
+          <w:bCs/>
+          <w:color w:val="000000" w:themeColor="text1"/>
+        </w:rPr>
+        <w:t xml:space="preserve"> </w:t>
+      </w:r>
+      <w:r>
+        <w:rPr>
+          <w:color w:val="000000" w:themeColor="text1"/>
+        </w:rPr>
+        <w:t xml:space="preserve">(AVCDL </w:t>
+      </w:r>
+      <w:r>
+        <w:rPr>
+          <w:color w:val="000000" w:themeColor="text1"/>
+        </w:rPr>
+        <w:t>secondary</w:t>
+      </w:r>
+      <w:r>
+        <w:rPr>
+          <w:color w:val="000000" w:themeColor="text1"/>
+        </w:rPr>
+        <w:t xml:space="preserve"> document)</w:t>
       </w:r>
     </w:p>
     <w:p>
@@ -3257,26 +3485,27 @@
           <w:bCs/>
           <w:color w:val="000000" w:themeColor="text1"/>
         </w:rPr>
-        <w:t xml:space="preserve">Static Analysis Report </w:t>
-      </w:r>
-      <w:r>
-        <w:rPr>
-          <w:color w:val="000000" w:themeColor="text1"/>
-        </w:rPr>
-        <w:t xml:space="preserve">(AVCDL </w:t>
-      </w:r>
-      <w:r>
-        <w:rPr>
-          <w:color w:val="000000" w:themeColor="text1"/>
-        </w:rPr>
-        <w:t>secondary</w:t>
-      </w:r>
-      <w:r>
-        <w:rPr>
-          <w:color w:val="000000" w:themeColor="text1"/>
-        </w:rPr>
-        <w:t xml:space="preserve"> document)</w:t>
-      </w:r>
+        <w:t>Static Analysis Results Interchange Format (SARIF) Version 2.1.0</w:t>
+      </w:r>
+      <w:r>
+        <w:rPr>
+          <w:color w:val="000000" w:themeColor="text1"/>
+        </w:rPr>
+        <w:br/>
+      </w:r>
+      <w:hyperlink r:id="rId15" w:history="1">
+        <w:r>
+          <w:rPr>
+            <w:rStyle w:val="Hyperlink"/>
+            <w:rFonts w:ascii="Courier New" w:hAnsi="Courier New" w:cs="Courier New"/>
+            <w:b/>
+            <w:bCs/>
+            <w:sz w:val="21"/>
+            <w:szCs w:val="21"/>
+          </w:rPr>
+          <w:t>https://docs.oasis-open.org/sarif/sarif/v2.1.0/os/sarif-v2.1.0-os.pdf</w:t>
+        </w:r>
+      </w:hyperlink>
     </w:p>
     <w:p>
       <w:pPr>
@@ -3296,25 +3525,13 @@
           <w:bCs/>
           <w:color w:val="000000" w:themeColor="text1"/>
         </w:rPr>
-        <w:t xml:space="preserve">Dynamic Analysis Report </w:t>
-      </w:r>
-      <w:r>
-        <w:rPr>
-          <w:color w:val="000000" w:themeColor="text1"/>
-        </w:rPr>
-        <w:t xml:space="preserve">(AVCDL </w:t>
-      </w:r>
-      <w:r>
-        <w:rPr>
-          <w:color w:val="000000" w:themeColor="text1"/>
-        </w:rPr>
-        <w:t>secondary</w:t>
-      </w:r>
-      <w:r>
-        <w:rPr>
-          <w:color w:val="000000" w:themeColor="text1"/>
-        </w:rPr>
-        <w:t xml:space="preserve"> document)</w:t>
+        <w:t xml:space="preserve">Report Generation </w:t>
+      </w:r>
+      <w:r>
+        <w:rPr>
+          <w:color w:val="000000" w:themeColor="text1"/>
+        </w:rPr>
+        <w:t>(AVCDL elaboration document)</w:t>
       </w:r>
     </w:p>
     <w:p>
@@ -3335,7 +3552,7 @@
           <w:bCs/>
           <w:color w:val="000000" w:themeColor="text1"/>
         </w:rPr>
-        <w:t>Static Analysis Results Interchange Format (SARIF) Version 2.1.0</w:t>
+        <w:t>Unit testing</w:t>
       </w:r>
       <w:r>
         <w:rPr>
@@ -3343,19 +3560,30 @@
         </w:rPr>
         <w:br/>
       </w:r>
-      <w:hyperlink r:id="rId15" w:history="1">
+      <w:hyperlink r:id="rId16" w:history="1">
         <w:r>
           <w:rPr>
             <w:rStyle w:val="Hyperlink"/>
+            <w:rFonts w:ascii="Courier New" w:hAnsi="Courier New" w:cs="Courier New"/>
+            <w:b/>
+            <w:bCs/>
+            <w:sz w:val="20"/>
+            <w:szCs w:val="20"/>
           </w:rPr>
-          <w:t>https://docs.oasis-open.org/sarif/sarif/v2.1.0/os/sarif-v2.1.0-os.pdf</w:t>
+          <w:t>https://en.wikipedia.org/wiki/Unit_testing</w:t>
         </w:r>
       </w:hyperlink>
+      <w:r>
+        <w:rPr>
+          <w:color w:val="000000" w:themeColor="text1"/>
+        </w:rPr>
+        <w:t xml:space="preserve"> </w:t>
+      </w:r>
     </w:p>
     <w:sectPr>
-      <w:footerReference w:type="even" r:id="rId16"/>
-      <w:footerReference w:type="default" r:id="rId17"/>
-      <w:headerReference w:type="first" r:id="rId18"/>
+      <w:footerReference w:type="even" r:id="rId17"/>
+      <w:footerReference w:type="default" r:id="rId18"/>
+      <w:headerReference w:type="first" r:id="rId19"/>
       <w:pgSz w:w="12240" w:h="15840"/>
       <w:pgMar w:top="1440" w:right="1440" w:bottom="1440" w:left="1440" w:header="720" w:footer="720" w:gutter="0"/>
       <w:pgNumType w:start="1"/>
@@ -3367,7 +3595,7 @@
 </file>
 
 <file path=word/endnotes.xml><?xml version="1.0" encoding="utf-8"?>
-<w:endnotes xmlns:wpc="http://schemas.microsoft.com/office/word/2010/wordprocessingCanvas" xmlns:cx="http://schemas.microsoft.com/office/drawing/2014/chartex" xmlns:cx1="http://schemas.microsoft.com/office/drawing/2015/9/8/chartex" xmlns:cx2="http://schemas.microsoft.com/office/drawing/2015/10/21/chartex" xmlns:cx3="http://schemas.microsoft.com/office/drawing/2016/5/9/chartex" xmlns:cx4="http://schemas.microsoft.com/office/drawing/2016/5/10/chartex" xmlns:cx5="http://schemas.microsoft.com/office/drawing/2016/5/11/chartex" xmlns:cx6="http://schemas.microsoft.com/office/drawing/2016/5/12/chartex" xmlns:cx7="http://schemas.microsoft.com/office/drawing/2016/5/13/chartex" xmlns:cx8="http://schemas.microsoft.com/office/drawing/2016/5/14/chartex" xmlns:mc="http://schemas.openxmlformats.org/markup-compatibility/2006" xmlns:aink="http://schemas.microsoft.com/office/drawing/2016/ink" xmlns:am3d="http://schemas.microsoft.com/office/drawing/2017/model3d" xmlns:o="urn:schemas-microsoft-com:office:office" xmlns:oel="http://schemas.microsoft.com/office/2019/extlst" xmlns:r="http://schemas.openxmlformats.org/officeDocument/2006/relationships" xmlns:m="http://schemas.openxmlformats.org/officeDocument/2006/math" xmlns:v="urn:schemas-microsoft-com:vml" xmlns:wp14="http://schemas.microsoft.com/office/word/2010/wordprocessingDrawing" xmlns:wp="http://schemas.openxmlformats.org/drawingml/2006/wordprocessingDrawing" xmlns:w10="urn:schemas-microsoft-com:office:word" xmlns:w="http://schemas.openxmlformats.org/wordprocessingml/2006/main" xmlns:w14="http://schemas.microsoft.com/office/word/2010/wordml" xmlns:w15="http://schemas.microsoft.com/office/word/2012/wordml" xmlns:w16cex="http://schemas.microsoft.com/office/word/2018/wordml/cex" xmlns:w16cid="http://schemas.microsoft.com/office/word/2016/wordml/cid" xmlns:w16="http://schemas.microsoft.com/office/word/2018/wordml" xmlns:w16sdtdh="http://schemas.microsoft.com/office/word/2020/wordml/sdtdatahash" xmlns:w16se="http://schemas.microsoft.com/office/word/2015/wordml/symex" xmlns:wpg="http://schemas.microsoft.com/office/word/2010/wordprocessingGroup" xmlns:wpi="http://schemas.microsoft.com/office/word/2010/wordprocessingInk" xmlns:wne="http://schemas.microsoft.com/office/word/2006/wordml" xmlns:wps="http://schemas.microsoft.com/office/word/2010/wordprocessingShape" mc:Ignorable="w14 w15 w16se w16cid w16 w16cex w16sdtdh wp14">
+<w:endnotes xmlns:wpc="http://schemas.microsoft.com/office/word/2010/wordprocessingCanvas" xmlns:cx="http://schemas.microsoft.com/office/drawing/2014/chartex" xmlns:cx1="http://schemas.microsoft.com/office/drawing/2015/9/8/chartex" xmlns:cx2="http://schemas.microsoft.com/office/drawing/2015/10/21/chartex" xmlns:cx3="http://schemas.microsoft.com/office/drawing/2016/5/9/chartex" xmlns:cx4="http://schemas.microsoft.com/office/drawing/2016/5/10/chartex" xmlns:cx5="http://schemas.microsoft.com/office/drawing/2016/5/11/chartex" xmlns:cx6="http://schemas.microsoft.com/office/drawing/2016/5/12/chartex" xmlns:cx7="http://schemas.microsoft.com/office/drawing/2016/5/13/chartex" xmlns:cx8="http://schemas.microsoft.com/office/drawing/2016/5/14/chartex" xmlns:mc="http://schemas.openxmlformats.org/markup-compatibility/2006" xmlns:aink="http://schemas.microsoft.com/office/drawing/2016/ink" xmlns:am3d="http://schemas.microsoft.com/office/drawing/2017/model3d" xmlns:o="urn:schemas-microsoft-com:office:office" xmlns:oel="http://schemas.microsoft.com/office/2019/extlst" xmlns:r="http://schemas.openxmlformats.org/officeDocument/2006/relationships" xmlns:m="http://schemas.openxmlformats.org/officeDocument/2006/math" xmlns:v="urn:schemas-microsoft-com:vml" xmlns:wp14="http://schemas.microsoft.com/office/word/2010/wordprocessingDrawing" xmlns:wp="http://schemas.openxmlformats.org/drawingml/2006/wordprocessingDrawing" xmlns:w10="urn:schemas-microsoft-com:office:word" xmlns:w="http://schemas.openxmlformats.org/wordprocessingml/2006/main" xmlns:w14="http://schemas.microsoft.com/office/word/2010/wordml" xmlns:w15="http://schemas.microsoft.com/office/word/2012/wordml" xmlns:w16cex="http://schemas.microsoft.com/office/word/2018/wordml/cex" xmlns:w16cid="http://schemas.microsoft.com/office/word/2016/wordml/cid" xmlns:w16="http://schemas.microsoft.com/office/word/2018/wordml" xmlns:w16du="http://schemas.microsoft.com/office/word/2023/wordml/word16du" xmlns:w16sdtdh="http://schemas.microsoft.com/office/word/2020/wordml/sdtdatahash" xmlns:w16sdtfl="http://schemas.microsoft.com/office/word/2024/wordml/sdtformatlock" xmlns:w16se="http://schemas.microsoft.com/office/word/2015/wordml/symex" xmlns:wpg="http://schemas.microsoft.com/office/word/2010/wordprocessingGroup" xmlns:wpi="http://schemas.microsoft.com/office/word/2010/wordprocessingInk" xmlns:wne="http://schemas.microsoft.com/office/word/2006/wordml" xmlns:wps="http://schemas.microsoft.com/office/word/2010/wordprocessingShape" mc:Ignorable="w14 w15 w16se w16cid w16 w16cex w16sdtdh w16sdtfl w16du wp14">
   <w:endnote w:type="separator" w:id="-1">
     <w:p>
       <w:pPr>
@@ -3392,7 +3620,7 @@
 </file>
 
 <file path=word/footer1.xml><?xml version="1.0" encoding="utf-8"?>
-<w:ftr xmlns:wpc="http://schemas.microsoft.com/office/word/2010/wordprocessingCanvas" xmlns:cx="http://schemas.microsoft.com/office/drawing/2014/chartex" xmlns:cx1="http://schemas.microsoft.com/office/drawing/2015/9/8/chartex" xmlns:cx2="http://schemas.microsoft.com/office/drawing/2015/10/21/chartex" xmlns:cx3="http://schemas.microsoft.com/office/drawing/2016/5/9/chartex" xmlns:cx4="http://schemas.microsoft.com/office/drawing/2016/5/10/chartex" xmlns:cx5="http://schemas.microsoft.com/office/drawing/2016/5/11/chartex" xmlns:cx6="http://schemas.microsoft.com/office/drawing/2016/5/12/chartex" xmlns:cx7="http://schemas.microsoft.com/office/drawing/2016/5/13/chartex" xmlns:cx8="http://schemas.microsoft.com/office/drawing/2016/5/14/chartex" xmlns:mc="http://schemas.openxmlformats.org/markup-compatibility/2006" xmlns:aink="http://schemas.microsoft.com/office/drawing/2016/ink" xmlns:am3d="http://schemas.microsoft.com/office/drawing/2017/model3d" xmlns:o="urn:schemas-microsoft-com:office:office" xmlns:oel="http://schemas.microsoft.com/office/2019/extlst" xmlns:r="http://schemas.openxmlformats.org/officeDocument/2006/relationships" xmlns:m="http://schemas.openxmlformats.org/officeDocument/2006/math" xmlns:v="urn:schemas-microsoft-com:vml" xmlns:wp14="http://schemas.microsoft.com/office/word/2010/wordprocessingDrawing" xmlns:wp="http://schemas.openxmlformats.org/drawingml/2006/wordprocessingDrawing" xmlns:w10="urn:schemas-microsoft-com:office:word" xmlns:w="http://schemas.openxmlformats.org/wordprocessingml/2006/main" xmlns:w14="http://schemas.microsoft.com/office/word/2010/wordml" xmlns:w15="http://schemas.microsoft.com/office/word/2012/wordml" xmlns:w16cex="http://schemas.microsoft.com/office/word/2018/wordml/cex" xmlns:w16cid="http://schemas.microsoft.com/office/word/2016/wordml/cid" xmlns:w16="http://schemas.microsoft.com/office/word/2018/wordml" xmlns:w16sdtdh="http://schemas.microsoft.com/office/word/2020/wordml/sdtdatahash" xmlns:w16se="http://schemas.microsoft.com/office/word/2015/wordml/symex" xmlns:wpg="http://schemas.microsoft.com/office/word/2010/wordprocessingGroup" xmlns:wpi="http://schemas.microsoft.com/office/word/2010/wordprocessingInk" xmlns:wne="http://schemas.microsoft.com/office/word/2006/wordml" xmlns:wps="http://schemas.microsoft.com/office/word/2010/wordprocessingShape" mc:Ignorable="w14 w15 w16se w16cid w16 w16cex w16sdtdh wp14">
+<w:ftr xmlns:wpc="http://schemas.microsoft.com/office/word/2010/wordprocessingCanvas" xmlns:cx="http://schemas.microsoft.com/office/drawing/2014/chartex" xmlns:cx1="http://schemas.microsoft.com/office/drawing/2015/9/8/chartex" xmlns:cx2="http://schemas.microsoft.com/office/drawing/2015/10/21/chartex" xmlns:cx3="http://schemas.microsoft.com/office/drawing/2016/5/9/chartex" xmlns:cx4="http://schemas.microsoft.com/office/drawing/2016/5/10/chartex" xmlns:cx5="http://schemas.microsoft.com/office/drawing/2016/5/11/chartex" xmlns:cx6="http://schemas.microsoft.com/office/drawing/2016/5/12/chartex" xmlns:cx7="http://schemas.microsoft.com/office/drawing/2016/5/13/chartex" xmlns:cx8="http://schemas.microsoft.com/office/drawing/2016/5/14/chartex" xmlns:mc="http://schemas.openxmlformats.org/markup-compatibility/2006" xmlns:aink="http://schemas.microsoft.com/office/drawing/2016/ink" xmlns:am3d="http://schemas.microsoft.com/office/drawing/2017/model3d" xmlns:o="urn:schemas-microsoft-com:office:office" xmlns:oel="http://schemas.microsoft.com/office/2019/extlst" xmlns:r="http://schemas.openxmlformats.org/officeDocument/2006/relationships" xmlns:m="http://schemas.openxmlformats.org/officeDocument/2006/math" xmlns:v="urn:schemas-microsoft-com:vml" xmlns:wp14="http://schemas.microsoft.com/office/word/2010/wordprocessingDrawing" xmlns:wp="http://schemas.openxmlformats.org/drawingml/2006/wordprocessingDrawing" xmlns:w10="urn:schemas-microsoft-com:office:word" xmlns:w="http://schemas.openxmlformats.org/wordprocessingml/2006/main" xmlns:w14="http://schemas.microsoft.com/office/word/2010/wordml" xmlns:w15="http://schemas.microsoft.com/office/word/2012/wordml" xmlns:w16cex="http://schemas.microsoft.com/office/word/2018/wordml/cex" xmlns:w16cid="http://schemas.microsoft.com/office/word/2016/wordml/cid" xmlns:w16="http://schemas.microsoft.com/office/word/2018/wordml" xmlns:w16du="http://schemas.microsoft.com/office/word/2023/wordml/word16du" xmlns:w16sdtdh="http://schemas.microsoft.com/office/word/2020/wordml/sdtdatahash" xmlns:w16sdtfl="http://schemas.microsoft.com/office/word/2024/wordml/sdtformatlock" xmlns:w16se="http://schemas.microsoft.com/office/word/2015/wordml/symex" xmlns:wpg="http://schemas.microsoft.com/office/word/2010/wordprocessingGroup" xmlns:wpi="http://schemas.microsoft.com/office/word/2010/wordprocessingInk" xmlns:wne="http://schemas.microsoft.com/office/word/2006/wordml" xmlns:wps="http://schemas.microsoft.com/office/word/2010/wordprocessingShape" mc:Ignorable="w14 w15 w16se w16cid w16 w16cex w16sdtdh w16sdtfl w16du wp14">
   <w:sdt>
     <w:sdtPr>
       <w:rPr>
@@ -3444,7 +3672,7 @@
 </file>
 
 <file path=word/footer2.xml><?xml version="1.0" encoding="utf-8"?>
-<w:ftr xmlns:wpc="http://schemas.microsoft.com/office/word/2010/wordprocessingCanvas" xmlns:cx="http://schemas.microsoft.com/office/drawing/2014/chartex" xmlns:cx1="http://schemas.microsoft.com/office/drawing/2015/9/8/chartex" xmlns:cx2="http://schemas.microsoft.com/office/drawing/2015/10/21/chartex" xmlns:cx3="http://schemas.microsoft.com/office/drawing/2016/5/9/chartex" xmlns:cx4="http://schemas.microsoft.com/office/drawing/2016/5/10/chartex" xmlns:cx5="http://schemas.microsoft.com/office/drawing/2016/5/11/chartex" xmlns:cx6="http://schemas.microsoft.com/office/drawing/2016/5/12/chartex" xmlns:cx7="http://schemas.microsoft.com/office/drawing/2016/5/13/chartex" xmlns:cx8="http://schemas.microsoft.com/office/drawing/2016/5/14/chartex" xmlns:mc="http://schemas.openxmlformats.org/markup-compatibility/2006" xmlns:aink="http://schemas.microsoft.com/office/drawing/2016/ink" xmlns:am3d="http://schemas.microsoft.com/office/drawing/2017/model3d" xmlns:o="urn:schemas-microsoft-com:office:office" xmlns:oel="http://schemas.microsoft.com/office/2019/extlst" xmlns:r="http://schemas.openxmlformats.org/officeDocument/2006/relationships" xmlns:m="http://schemas.openxmlformats.org/officeDocument/2006/math" xmlns:v="urn:schemas-microsoft-com:vml" xmlns:wp14="http://schemas.microsoft.com/office/word/2010/wordprocessingDrawing" xmlns:wp="http://schemas.openxmlformats.org/drawingml/2006/wordprocessingDrawing" xmlns:w10="urn:schemas-microsoft-com:office:word" xmlns:w="http://schemas.openxmlformats.org/wordprocessingml/2006/main" xmlns:w14="http://schemas.microsoft.com/office/word/2010/wordml" xmlns:w15="http://schemas.microsoft.com/office/word/2012/wordml" xmlns:w16cex="http://schemas.microsoft.com/office/word/2018/wordml/cex" xmlns:w16cid="http://schemas.microsoft.com/office/word/2016/wordml/cid" xmlns:w16="http://schemas.microsoft.com/office/word/2018/wordml" xmlns:w16sdtdh="http://schemas.microsoft.com/office/word/2020/wordml/sdtdatahash" xmlns:w16se="http://schemas.microsoft.com/office/word/2015/wordml/symex" xmlns:wpg="http://schemas.microsoft.com/office/word/2010/wordprocessingGroup" xmlns:wpi="http://schemas.microsoft.com/office/word/2010/wordprocessingInk" xmlns:wne="http://schemas.microsoft.com/office/word/2006/wordml" xmlns:wps="http://schemas.microsoft.com/office/word/2010/wordprocessingShape" mc:Ignorable="w14 w15 w16se w16cid w16 w16cex w16sdtdh wp14">
+<w:ftr xmlns:wpc="http://schemas.microsoft.com/office/word/2010/wordprocessingCanvas" xmlns:cx="http://schemas.microsoft.com/office/drawing/2014/chartex" xmlns:cx1="http://schemas.microsoft.com/office/drawing/2015/9/8/chartex" xmlns:cx2="http://schemas.microsoft.com/office/drawing/2015/10/21/chartex" xmlns:cx3="http://schemas.microsoft.com/office/drawing/2016/5/9/chartex" xmlns:cx4="http://schemas.microsoft.com/office/drawing/2016/5/10/chartex" xmlns:cx5="http://schemas.microsoft.com/office/drawing/2016/5/11/chartex" xmlns:cx6="http://schemas.microsoft.com/office/drawing/2016/5/12/chartex" xmlns:cx7="http://schemas.microsoft.com/office/drawing/2016/5/13/chartex" xmlns:cx8="http://schemas.microsoft.com/office/drawing/2016/5/14/chartex" xmlns:mc="http://schemas.openxmlformats.org/markup-compatibility/2006" xmlns:aink="http://schemas.microsoft.com/office/drawing/2016/ink" xmlns:am3d="http://schemas.microsoft.com/office/drawing/2017/model3d" xmlns:o="urn:schemas-microsoft-com:office:office" xmlns:oel="http://schemas.microsoft.com/office/2019/extlst" xmlns:r="http://schemas.openxmlformats.org/officeDocument/2006/relationships" xmlns:m="http://schemas.openxmlformats.org/officeDocument/2006/math" xmlns:v="urn:schemas-microsoft-com:vml" xmlns:wp14="http://schemas.microsoft.com/office/word/2010/wordprocessingDrawing" xmlns:wp="http://schemas.openxmlformats.org/drawingml/2006/wordprocessingDrawing" xmlns:w10="urn:schemas-microsoft-com:office:word" xmlns:w="http://schemas.openxmlformats.org/wordprocessingml/2006/main" xmlns:w14="http://schemas.microsoft.com/office/word/2010/wordml" xmlns:w15="http://schemas.microsoft.com/office/word/2012/wordml" xmlns:w16cex="http://schemas.microsoft.com/office/word/2018/wordml/cex" xmlns:w16cid="http://schemas.microsoft.com/office/word/2016/wordml/cid" xmlns:w16="http://schemas.microsoft.com/office/word/2018/wordml" xmlns:w16du="http://schemas.microsoft.com/office/word/2023/wordml/word16du" xmlns:w16sdtdh="http://schemas.microsoft.com/office/word/2020/wordml/sdtdatahash" xmlns:w16sdtfl="http://schemas.microsoft.com/office/word/2024/wordml/sdtformatlock" xmlns:w16se="http://schemas.microsoft.com/office/word/2015/wordml/symex" xmlns:wpg="http://schemas.microsoft.com/office/word/2010/wordprocessingGroup" xmlns:wpi="http://schemas.microsoft.com/office/word/2010/wordprocessingInk" xmlns:wne="http://schemas.microsoft.com/office/word/2006/wordml" xmlns:wps="http://schemas.microsoft.com/office/word/2010/wordprocessingShape" mc:Ignorable="w14 w15 w16se w16cid w16 w16cex w16sdtdh w16sdtfl w16du wp14">
   <w:sdt>
     <w:sdtPr>
       <w:rPr>
@@ -3509,7 +3737,7 @@
 </file>
 
 <file path=word/footnotes.xml><?xml version="1.0" encoding="utf-8"?>
-<w:footnotes xmlns:wpc="http://schemas.microsoft.com/office/word/2010/wordprocessingCanvas" xmlns:cx="http://schemas.microsoft.com/office/drawing/2014/chartex" xmlns:cx1="http://schemas.microsoft.com/office/drawing/2015/9/8/chartex" xmlns:cx2="http://schemas.microsoft.com/office/drawing/2015/10/21/chartex" xmlns:cx3="http://schemas.microsoft.com/office/drawing/2016/5/9/chartex" xmlns:cx4="http://schemas.microsoft.com/office/drawing/2016/5/10/chartex" xmlns:cx5="http://schemas.microsoft.com/office/drawing/2016/5/11/chartex" xmlns:cx6="http://schemas.microsoft.com/office/drawing/2016/5/12/chartex" xmlns:cx7="http://schemas.microsoft.com/office/drawing/2016/5/13/chartex" xmlns:cx8="http://schemas.microsoft.com/office/drawing/2016/5/14/chartex" xmlns:mc="http://schemas.openxmlformats.org/markup-compatibility/2006" xmlns:aink="http://schemas.microsoft.com/office/drawing/2016/ink" xmlns:am3d="http://schemas.microsoft.com/office/drawing/2017/model3d" xmlns:o="urn:schemas-microsoft-com:office:office" xmlns:oel="http://schemas.microsoft.com/office/2019/extlst" xmlns:r="http://schemas.openxmlformats.org/officeDocument/2006/relationships" xmlns:m="http://schemas.openxmlformats.org/officeDocument/2006/math" xmlns:v="urn:schemas-microsoft-com:vml" xmlns:wp14="http://schemas.microsoft.com/office/word/2010/wordprocessingDrawing" xmlns:wp="http://schemas.openxmlformats.org/drawingml/2006/wordprocessingDrawing" xmlns:w10="urn:schemas-microsoft-com:office:word" xmlns:w="http://schemas.openxmlformats.org/wordprocessingml/2006/main" xmlns:w14="http://schemas.microsoft.com/office/word/2010/wordml" xmlns:w15="http://schemas.microsoft.com/office/word/2012/wordml" xmlns:w16cex="http://schemas.microsoft.com/office/word/2018/wordml/cex" xmlns:w16cid="http://schemas.microsoft.com/office/word/2016/wordml/cid" xmlns:w16="http://schemas.microsoft.com/office/word/2018/wordml" xmlns:w16sdtdh="http://schemas.microsoft.com/office/word/2020/wordml/sdtdatahash" xmlns:w16se="http://schemas.microsoft.com/office/word/2015/wordml/symex" xmlns:wpg="http://schemas.microsoft.com/office/word/2010/wordprocessingGroup" xmlns:wpi="http://schemas.microsoft.com/office/word/2010/wordprocessingInk" xmlns:wne="http://schemas.microsoft.com/office/word/2006/wordml" xmlns:wps="http://schemas.microsoft.com/office/word/2010/wordprocessingShape" mc:Ignorable="w14 w15 w16se w16cid w16 w16cex w16sdtdh wp14">
+<w:footnotes xmlns:wpc="http://schemas.microsoft.com/office/word/2010/wordprocessingCanvas" xmlns:cx="http://schemas.microsoft.com/office/drawing/2014/chartex" xmlns:cx1="http://schemas.microsoft.com/office/drawing/2015/9/8/chartex" xmlns:cx2="http://schemas.microsoft.com/office/drawing/2015/10/21/chartex" xmlns:cx3="http://schemas.microsoft.com/office/drawing/2016/5/9/chartex" xmlns:cx4="http://schemas.microsoft.com/office/drawing/2016/5/10/chartex" xmlns:cx5="http://schemas.microsoft.com/office/drawing/2016/5/11/chartex" xmlns:cx6="http://schemas.microsoft.com/office/drawing/2016/5/12/chartex" xmlns:cx7="http://schemas.microsoft.com/office/drawing/2016/5/13/chartex" xmlns:cx8="http://schemas.microsoft.com/office/drawing/2016/5/14/chartex" xmlns:mc="http://schemas.openxmlformats.org/markup-compatibility/2006" xmlns:aink="http://schemas.microsoft.com/office/drawing/2016/ink" xmlns:am3d="http://schemas.microsoft.com/office/drawing/2017/model3d" xmlns:o="urn:schemas-microsoft-com:office:office" xmlns:oel="http://schemas.microsoft.com/office/2019/extlst" xmlns:r="http://schemas.openxmlformats.org/officeDocument/2006/relationships" xmlns:m="http://schemas.openxmlformats.org/officeDocument/2006/math" xmlns:v="urn:schemas-microsoft-com:vml" xmlns:wp14="http://schemas.microsoft.com/office/word/2010/wordprocessingDrawing" xmlns:wp="http://schemas.openxmlformats.org/drawingml/2006/wordprocessingDrawing" xmlns:w10="urn:schemas-microsoft-com:office:word" xmlns:w="http://schemas.openxmlformats.org/wordprocessingml/2006/main" xmlns:w14="http://schemas.microsoft.com/office/word/2010/wordml" xmlns:w15="http://schemas.microsoft.com/office/word/2012/wordml" xmlns:w16cex="http://schemas.microsoft.com/office/word/2018/wordml/cex" xmlns:w16cid="http://schemas.microsoft.com/office/word/2016/wordml/cid" xmlns:w16="http://schemas.microsoft.com/office/word/2018/wordml" xmlns:w16du="http://schemas.microsoft.com/office/word/2023/wordml/word16du" xmlns:w16sdtdh="http://schemas.microsoft.com/office/word/2020/wordml/sdtdatahash" xmlns:w16sdtfl="http://schemas.microsoft.com/office/word/2024/wordml/sdtformatlock" xmlns:w16se="http://schemas.microsoft.com/office/word/2015/wordml/symex" xmlns:wpg="http://schemas.microsoft.com/office/word/2010/wordprocessingGroup" xmlns:wpi="http://schemas.microsoft.com/office/word/2010/wordprocessingInk" xmlns:wne="http://schemas.microsoft.com/office/word/2006/wordml" xmlns:wps="http://schemas.microsoft.com/office/word/2010/wordprocessingShape" mc:Ignorable="w14 w15 w16se w16cid w16 w16cex w16sdtdh w16sdtfl w16du wp14">
   <w:footnote w:type="separator" w:id="-1">
     <w:p>
       <w:pPr>
@@ -3534,7 +3762,7 @@
 </file>
 
 <file path=word/header1.xml><?xml version="1.0" encoding="utf-8"?>
-<w:hdr xmlns:wpc="http://schemas.microsoft.com/office/word/2010/wordprocessingCanvas" xmlns:cx="http://schemas.microsoft.com/office/drawing/2014/chartex" xmlns:cx1="http://schemas.microsoft.com/office/drawing/2015/9/8/chartex" xmlns:cx2="http://schemas.microsoft.com/office/drawing/2015/10/21/chartex" xmlns:cx3="http://schemas.microsoft.com/office/drawing/2016/5/9/chartex" xmlns:cx4="http://schemas.microsoft.com/office/drawing/2016/5/10/chartex" xmlns:cx5="http://schemas.microsoft.com/office/drawing/2016/5/11/chartex" xmlns:cx6="http://schemas.microsoft.com/office/drawing/2016/5/12/chartex" xmlns:cx7="http://schemas.microsoft.com/office/drawing/2016/5/13/chartex" xmlns:cx8="http://schemas.microsoft.com/office/drawing/2016/5/14/chartex" xmlns:mc="http://schemas.openxmlformats.org/markup-compatibility/2006" xmlns:aink="http://schemas.microsoft.com/office/drawing/2016/ink" xmlns:am3d="http://schemas.microsoft.com/office/drawing/2017/model3d" xmlns:o="urn:schemas-microsoft-com:office:office" xmlns:oel="http://schemas.microsoft.com/office/2019/extlst" xmlns:r="http://schemas.openxmlformats.org/officeDocument/2006/relationships" xmlns:m="http://schemas.openxmlformats.org/officeDocument/2006/math" xmlns:v="urn:schemas-microsoft-com:vml" xmlns:wp14="http://schemas.microsoft.com/office/word/2010/wordprocessingDrawing" xmlns:wp="http://schemas.openxmlformats.org/drawingml/2006/wordprocessingDrawing" xmlns:w10="urn:schemas-microsoft-com:office:word" xmlns:w="http://schemas.openxmlformats.org/wordprocessingml/2006/main" xmlns:w14="http://schemas.microsoft.com/office/word/2010/wordml" xmlns:w15="http://schemas.microsoft.com/office/word/2012/wordml" xmlns:w16cex="http://schemas.microsoft.com/office/word/2018/wordml/cex" xmlns:w16cid="http://schemas.microsoft.com/office/word/2016/wordml/cid" xmlns:w16="http://schemas.microsoft.com/office/word/2018/wordml" xmlns:w16sdtdh="http://schemas.microsoft.com/office/word/2020/wordml/sdtdatahash" xmlns:w16se="http://schemas.microsoft.com/office/word/2015/wordml/symex" xmlns:wpg="http://schemas.microsoft.com/office/word/2010/wordprocessingGroup" xmlns:wpi="http://schemas.microsoft.com/office/word/2010/wordprocessingInk" xmlns:wne="http://schemas.microsoft.com/office/word/2006/wordml" xmlns:wps="http://schemas.microsoft.com/office/word/2010/wordprocessingShape" mc:Ignorable="w14 w15 w16se w16cid w16 w16cex w16sdtdh wp14">
+<w:hdr xmlns:wpc="http://schemas.microsoft.com/office/word/2010/wordprocessingCanvas" xmlns:cx="http://schemas.microsoft.com/office/drawing/2014/chartex" xmlns:cx1="http://schemas.microsoft.com/office/drawing/2015/9/8/chartex" xmlns:cx2="http://schemas.microsoft.com/office/drawing/2015/10/21/chartex" xmlns:cx3="http://schemas.microsoft.com/office/drawing/2016/5/9/chartex" xmlns:cx4="http://schemas.microsoft.com/office/drawing/2016/5/10/chartex" xmlns:cx5="http://schemas.microsoft.com/office/drawing/2016/5/11/chartex" xmlns:cx6="http://schemas.microsoft.com/office/drawing/2016/5/12/chartex" xmlns:cx7="http://schemas.microsoft.com/office/drawing/2016/5/13/chartex" xmlns:cx8="http://schemas.microsoft.com/office/drawing/2016/5/14/chartex" xmlns:mc="http://schemas.openxmlformats.org/markup-compatibility/2006" xmlns:aink="http://schemas.microsoft.com/office/drawing/2016/ink" xmlns:am3d="http://schemas.microsoft.com/office/drawing/2017/model3d" xmlns:o="urn:schemas-microsoft-com:office:office" xmlns:oel="http://schemas.microsoft.com/office/2019/extlst" xmlns:r="http://schemas.openxmlformats.org/officeDocument/2006/relationships" xmlns:m="http://schemas.openxmlformats.org/officeDocument/2006/math" xmlns:v="urn:schemas-microsoft-com:vml" xmlns:wp14="http://schemas.microsoft.com/office/word/2010/wordprocessingDrawing" xmlns:wp="http://schemas.openxmlformats.org/drawingml/2006/wordprocessingDrawing" xmlns:w10="urn:schemas-microsoft-com:office:word" xmlns:w="http://schemas.openxmlformats.org/wordprocessingml/2006/main" xmlns:w14="http://schemas.microsoft.com/office/word/2010/wordml" xmlns:w15="http://schemas.microsoft.com/office/word/2012/wordml" xmlns:w16cex="http://schemas.microsoft.com/office/word/2018/wordml/cex" xmlns:w16cid="http://schemas.microsoft.com/office/word/2016/wordml/cid" xmlns:w16="http://schemas.microsoft.com/office/word/2018/wordml" xmlns:w16du="http://schemas.microsoft.com/office/word/2023/wordml/word16du" xmlns:w16sdtdh="http://schemas.microsoft.com/office/word/2020/wordml/sdtdatahash" xmlns:w16sdtfl="http://schemas.microsoft.com/office/word/2024/wordml/sdtformatlock" xmlns:w16se="http://schemas.microsoft.com/office/word/2015/wordml/symex" xmlns:wpg="http://schemas.microsoft.com/office/word/2010/wordprocessingGroup" xmlns:wpi="http://schemas.microsoft.com/office/word/2010/wordprocessingInk" xmlns:wne="http://schemas.microsoft.com/office/word/2006/wordml" xmlns:wps="http://schemas.microsoft.com/office/word/2010/wordprocessingShape" mc:Ignorable="w14 w15 w16se w16cid w16 w16cex w16sdtdh w16sdtfl w16du wp14">
   <w:p>
     <w:pPr>
       <w:pStyle w:val="Header"/>
@@ -3551,7 +3779,7 @@
 </file>
 
 <file path=word/numbering.xml><?xml version="1.0" encoding="utf-8"?>
-<w:numbering xmlns:wpc="http://schemas.microsoft.com/office/word/2010/wordprocessingCanvas" xmlns:cx="http://schemas.microsoft.com/office/drawing/2014/chartex" xmlns:cx1="http://schemas.microsoft.com/office/drawing/2015/9/8/chartex" xmlns:cx2="http://schemas.microsoft.com/office/drawing/2015/10/21/chartex" xmlns:cx3="http://schemas.microsoft.com/office/drawing/2016/5/9/chartex" xmlns:cx4="http://schemas.microsoft.com/office/drawing/2016/5/10/chartex" xmlns:cx5="http://schemas.microsoft.com/office/drawing/2016/5/11/chartex" xmlns:cx6="http://schemas.microsoft.com/office/drawing/2016/5/12/chartex" xmlns:cx7="http://schemas.microsoft.com/office/drawing/2016/5/13/chartex" xmlns:cx8="http://schemas.microsoft.com/office/drawing/2016/5/14/chartex" xmlns:mc="http://schemas.openxmlformats.org/markup-compatibility/2006" xmlns:aink="http://schemas.microsoft.com/office/drawing/2016/ink" xmlns:am3d="http://schemas.microsoft.com/office/drawing/2017/model3d" xmlns:o="urn:schemas-microsoft-com:office:office" xmlns:oel="http://schemas.microsoft.com/office/2019/extlst" xmlns:r="http://schemas.openxmlformats.org/officeDocument/2006/relationships" xmlns:m="http://schemas.openxmlformats.org/officeDocument/2006/math" xmlns:v="urn:schemas-microsoft-com:vml" xmlns:wp14="http://schemas.microsoft.com/office/word/2010/wordprocessingDrawing" xmlns:wp="http://schemas.openxmlformats.org/drawingml/2006/wordprocessingDrawing" xmlns:w10="urn:schemas-microsoft-com:office:word" xmlns:w="http://schemas.openxmlformats.org/wordprocessingml/2006/main" xmlns:w14="http://schemas.microsoft.com/office/word/2010/wordml" xmlns:w15="http://schemas.microsoft.com/office/word/2012/wordml" xmlns:w16cex="http://schemas.microsoft.com/office/word/2018/wordml/cex" xmlns:w16cid="http://schemas.microsoft.com/office/word/2016/wordml/cid" xmlns:w16="http://schemas.microsoft.com/office/word/2018/wordml" xmlns:w16sdtdh="http://schemas.microsoft.com/office/word/2020/wordml/sdtdatahash" xmlns:w16se="http://schemas.microsoft.com/office/word/2015/wordml/symex" xmlns:wpg="http://schemas.microsoft.com/office/word/2010/wordprocessingGroup" xmlns:wpi="http://schemas.microsoft.com/office/word/2010/wordprocessingInk" xmlns:wne="http://schemas.microsoft.com/office/word/2006/wordml" xmlns:wps="http://schemas.microsoft.com/office/word/2010/wordprocessingShape" mc:Ignorable="w14 w15 w16se w16cid w16 w16cex w16sdtdh wp14">
+<w:numbering xmlns:wpc="http://schemas.microsoft.com/office/word/2010/wordprocessingCanvas" xmlns:cx="http://schemas.microsoft.com/office/drawing/2014/chartex" xmlns:cx1="http://schemas.microsoft.com/office/drawing/2015/9/8/chartex" xmlns:cx2="http://schemas.microsoft.com/office/drawing/2015/10/21/chartex" xmlns:cx3="http://schemas.microsoft.com/office/drawing/2016/5/9/chartex" xmlns:cx4="http://schemas.microsoft.com/office/drawing/2016/5/10/chartex" xmlns:cx5="http://schemas.microsoft.com/office/drawing/2016/5/11/chartex" xmlns:cx6="http://schemas.microsoft.com/office/drawing/2016/5/12/chartex" xmlns:cx7="http://schemas.microsoft.com/office/drawing/2016/5/13/chartex" xmlns:cx8="http://schemas.microsoft.com/office/drawing/2016/5/14/chartex" xmlns:mc="http://schemas.openxmlformats.org/markup-compatibility/2006" xmlns:aink="http://schemas.microsoft.com/office/drawing/2016/ink" xmlns:am3d="http://schemas.microsoft.com/office/drawing/2017/model3d" xmlns:o="urn:schemas-microsoft-com:office:office" xmlns:oel="http://schemas.microsoft.com/office/2019/extlst" xmlns:r="http://schemas.openxmlformats.org/officeDocument/2006/relationships" xmlns:m="http://schemas.openxmlformats.org/officeDocument/2006/math" xmlns:v="urn:schemas-microsoft-com:vml" xmlns:wp14="http://schemas.microsoft.com/office/word/2010/wordprocessingDrawing" xmlns:wp="http://schemas.openxmlformats.org/drawingml/2006/wordprocessingDrawing" xmlns:w10="urn:schemas-microsoft-com:office:word" xmlns:w="http://schemas.openxmlformats.org/wordprocessingml/2006/main" xmlns:w14="http://schemas.microsoft.com/office/word/2010/wordml" xmlns:w15="http://schemas.microsoft.com/office/word/2012/wordml" xmlns:w16cex="http://schemas.microsoft.com/office/word/2018/wordml/cex" xmlns:w16cid="http://schemas.microsoft.com/office/word/2016/wordml/cid" xmlns:w16="http://schemas.microsoft.com/office/word/2018/wordml" xmlns:w16du="http://schemas.microsoft.com/office/word/2023/wordml/word16du" xmlns:w16sdtdh="http://schemas.microsoft.com/office/word/2020/wordml/sdtdatahash" xmlns:w16sdtfl="http://schemas.microsoft.com/office/word/2024/wordml/sdtformatlock" xmlns:w16se="http://schemas.microsoft.com/office/word/2015/wordml/symex" xmlns:wpg="http://schemas.microsoft.com/office/word/2010/wordprocessingGroup" xmlns:wpi="http://schemas.microsoft.com/office/word/2010/wordprocessingInk" xmlns:wne="http://schemas.microsoft.com/office/word/2006/wordml" xmlns:wps="http://schemas.microsoft.com/office/word/2010/wordprocessingShape" mc:Ignorable="w14 w15 w16se w16cid w16 w16cex w16sdtdh w16sdtfl w16du wp14">
   <w:abstractNum w:abstractNumId="0" w15:restartNumberingAfterBreak="0">
     <w:nsid w:val="0C391F0A"/>
     <w:multiLevelType w:val="hybridMultilevel"/>
@@ -4894,7 +5122,7 @@
 </file>
 
 <file path=word/styles.xml><?xml version="1.0" encoding="utf-8"?>
-<w:styles xmlns:mc="http://schemas.openxmlformats.org/markup-compatibility/2006" xmlns:r="http://schemas.openxmlformats.org/officeDocument/2006/relationships" xmlns:w="http://schemas.openxmlformats.org/wordprocessingml/2006/main" xmlns:w14="http://schemas.microsoft.com/office/word/2010/wordml" xmlns:w15="http://schemas.microsoft.com/office/word/2012/wordml" xmlns:w16cex="http://schemas.microsoft.com/office/word/2018/wordml/cex" xmlns:w16cid="http://schemas.microsoft.com/office/word/2016/wordml/cid" xmlns:w16="http://schemas.microsoft.com/office/word/2018/wordml" xmlns:w16sdtdh="http://schemas.microsoft.com/office/word/2020/wordml/sdtdatahash" xmlns:w16se="http://schemas.microsoft.com/office/word/2015/wordml/symex" mc:Ignorable="w14 w15 w16se w16cid w16 w16cex w16sdtdh">
+<w:styles xmlns:mc="http://schemas.openxmlformats.org/markup-compatibility/2006" xmlns:r="http://schemas.openxmlformats.org/officeDocument/2006/relationships" xmlns:w="http://schemas.openxmlformats.org/wordprocessingml/2006/main" xmlns:w14="http://schemas.microsoft.com/office/word/2010/wordml" xmlns:w15="http://schemas.microsoft.com/office/word/2012/wordml" xmlns:w16cex="http://schemas.microsoft.com/office/word/2018/wordml/cex" xmlns:w16cid="http://schemas.microsoft.com/office/word/2016/wordml/cid" xmlns:w16="http://schemas.microsoft.com/office/word/2018/wordml" xmlns:w16du="http://schemas.microsoft.com/office/word/2023/wordml/word16du" xmlns:w16sdtdh="http://schemas.microsoft.com/office/word/2020/wordml/sdtdatahash" xmlns:w16sdtfl="http://schemas.microsoft.com/office/word/2024/wordml/sdtformatlock" xmlns:w16se="http://schemas.microsoft.com/office/word/2015/wordml/symex" mc:Ignorable="w14 w15 w16se w16cid w16 w16cex w16sdtdh w16sdtfl w16du">
   <w:docDefaults>
     <w:rPrDefault>
       <w:rPr>

</xml_diff>

<commit_message>
Updated the Fuzz Testing Report secondary document (additional references)
</commit_message>
<xml_diff>
--- a/source/reference_documents/secondary_documents/implementation phase/Fuzz Testing Report/Fuzz Testing Report.docx
+++ b/source/reference_documents/secondary_documents/implementation phase/Fuzz Testing Report/Fuzz Testing Report.docx
@@ -28,7 +28,7 @@
         <w:t xml:space="preserve">Version </w:t>
       </w:r>
       <w:r>
-        <w:t>8</w:t>
+        <w:t>9</w:t>
       </w:r>
     </w:p>
     <w:p>
@@ -45,7 +45,7 @@
         <w:rPr>
           <w:noProof/>
         </w:rPr>
-        <w:t>4/27/26 8:15 AM</w:t>
+        <w:t>4/28/26 2:22 PM</w:t>
       </w:r>
       <w:r>
         <w:fldChar w:fldCharType="end"/>
@@ -764,7 +764,7 @@
           <w:noProof/>
         </w:rPr>
         <w:drawing>
-          <wp:inline distT="0" distB="0" distL="0" distR="0" wp14:anchorId="76FE7134" wp14:editId="43D92447">
+          <wp:inline distT="0" distB="0" distL="0" distR="0" wp14:anchorId="76FE7134" wp14:editId="1EA33558">
             <wp:extent cx="3684761" cy="4384954"/>
             <wp:effectExtent l="0" t="0" r="0" b="0"/>
             <wp:docPr id="2" name="Picture 2"/>
@@ -3580,10 +3580,105 @@
         <w:t xml:space="preserve"> </w:t>
       </w:r>
     </w:p>
+    <w:p>
+      <w:pPr>
+        <w:pStyle w:val="ListParagraph"/>
+        <w:numPr>
+          <w:ilvl w:val="0"/>
+          <w:numId w:val="1"/>
+        </w:numPr>
+        <w:ind w:left="360"/>
+        <w:rPr>
+          <w:color w:val="000000" w:themeColor="text1"/>
+        </w:rPr>
+      </w:pPr>
+      <w:r>
+        <w:rPr>
+          <w:b/>
+          <w:bCs/>
+          <w:color w:val="000000" w:themeColor="text1"/>
+        </w:rPr>
+        <w:t>Building Secure and Reliable Systems, Chapter 13 – Testing Code</w:t>
+      </w:r>
+      <w:r>
+        <w:rPr>
+          <w:b/>
+          <w:bCs/>
+          <w:color w:val="000000" w:themeColor="text1"/>
+        </w:rPr>
+        <w:br/>
+      </w:r>
+      <w:hyperlink r:id="rId17" w:history="1">
+        <w:r>
+          <w:rPr>
+            <w:rStyle w:val="Hyperlink"/>
+            <w:rFonts w:ascii="Courier New" w:hAnsi="Courier New" w:cs="Courier New"/>
+            <w:b/>
+            <w:bCs/>
+          </w:rPr>
+          <w:t>https://google.github.io/building-secure-and-reliable-systems/raw/ch13.html</w:t>
+        </w:r>
+      </w:hyperlink>
+      <w:r>
+        <w:rPr>
+          <w:color w:val="000000" w:themeColor="text1"/>
+        </w:rPr>
+        <w:t xml:space="preserve"> </w:t>
+      </w:r>
+    </w:p>
+    <w:p>
+      <w:pPr>
+        <w:pStyle w:val="ListParagraph"/>
+        <w:numPr>
+          <w:ilvl w:val="0"/>
+          <w:numId w:val="1"/>
+        </w:numPr>
+        <w:ind w:left="360"/>
+        <w:rPr>
+          <w:color w:val="000000" w:themeColor="text1"/>
+        </w:rPr>
+      </w:pPr>
+      <w:r>
+        <w:rPr>
+          <w:b/>
+          <w:bCs/>
+          <w:color w:val="000000" w:themeColor="text1"/>
+        </w:rPr>
+        <w:t>Trail of Bits: Testing Handbook – Fuzzing</w:t>
+      </w:r>
+      <w:r>
+        <w:rPr>
+          <w:b/>
+          <w:bCs/>
+          <w:color w:val="000000" w:themeColor="text1"/>
+        </w:rPr>
+        <w:br/>
+      </w:r>
+      <w:hyperlink r:id="rId18" w:history="1">
+        <w:r>
+          <w:rPr>
+            <w:rStyle w:val="Hyperlink"/>
+            <w:rFonts w:ascii="Courier New" w:hAnsi="Courier New" w:cs="Courier New"/>
+            <w:b/>
+            <w:bCs/>
+          </w:rPr>
+          <w:t>https://appsec.guide/docs/fuzzing/</w:t>
+        </w:r>
+      </w:hyperlink>
+      <w:r>
+        <w:rPr>
+          <w:rFonts w:ascii="Courier New" w:hAnsi="Courier New" w:cs="Courier New"/>
+          <w:b/>
+          <w:bCs/>
+          <w:color w:val="000000" w:themeColor="text1"/>
+        </w:rPr>
+        <w:t xml:space="preserve"> </w:t>
+      </w:r>
+    </w:p>
     <w:sectPr>
-      <w:footerReference w:type="even" r:id="rId17"/>
-      <w:footerReference w:type="default" r:id="rId18"/>
-      <w:headerReference w:type="first" r:id="rId19"/>
+      <w:footerReference w:type="even" r:id="rId19"/>
+      <w:footerReference w:type="default" r:id="rId20"/>
+      <w:headerReference w:type="first" r:id="rId21"/>
       <w:pgSz w:w="12240" w:h="15840"/>
       <w:pgMar w:top="1440" w:right="1440" w:bottom="1440" w:left="1440" w:header="720" w:footer="720" w:gutter="0"/>
       <w:pgNumType w:start="1"/>

</xml_diff>